<commit_message>
Changed table data type from CHAR to VARCHAR
</commit_message>
<xml_diff>
--- a/QLNhaXac/QuanLiNhaXac.docx
+++ b/QLNhaXac/QuanLiNhaXac.docx
@@ -1,10 +1,13 @@
 
 <file path=word/document.xml><?xml version="1.0" encoding="utf-8"?>
-<w:document xmlns:wpc="http://schemas.microsoft.com/office/word/2010/wordprocessingCanvas" xmlns:cx="http://schemas.microsoft.com/office/drawing/2014/chartex" xmlns:cx1="http://schemas.microsoft.com/office/drawing/2015/9/8/chartex" xmlns:cx2="http://schemas.microsoft.com/office/drawing/2015/10/21/chartex" xmlns:cx3="http://schemas.microsoft.com/office/drawing/2016/5/9/chartex" xmlns:cx4="http://schemas.microsoft.com/office/drawing/2016/5/10/chartex" xmlns:cx5="http://schemas.microsoft.com/office/drawing/2016/5/11/chartex" xmlns:cx6="http://schemas.microsoft.com/office/drawing/2016/5/12/chartex" xmlns:cx7="http://schemas.microsoft.com/office/drawing/2016/5/13/chartex" xmlns:cx8="http://schemas.microsoft.com/office/drawing/2016/5/14/chartex" xmlns:mc="http://schemas.openxmlformats.org/markup-compatibility/2006" xmlns:aink="http://schemas.microsoft.com/office/drawing/2016/ink" xmlns:am3d="http://schemas.microsoft.com/office/drawing/2017/model3d" xmlns:o="urn:schemas-microsoft-com:office:office" xmlns:oel="http://schemas.microsoft.com/office/2019/extlst" xmlns:r="http://schemas.openxmlformats.org/officeDocument/2006/relationships" xmlns:m="http://schemas.openxmlformats.org/officeDocument/2006/math" xmlns:v="urn:schemas-microsoft-com:vml" xmlns:wp14="http://schemas.microsoft.com/office/word/2010/wordprocessingDrawing" xmlns:wp="http://schemas.openxmlformats.org/drawingml/2006/wordprocessingDrawing" xmlns:w10="urn:schemas-microsoft-com:office:word" xmlns:w="http://schemas.openxmlformats.org/wordprocessingml/2006/main" xmlns:w14="http://schemas.microsoft.com/office/word/2010/wordml" xmlns:w15="http://schemas.microsoft.com/office/word/2012/wordml" xmlns:w16cex="http://schemas.microsoft.com/office/word/2018/wordml/cex" xmlns:w16cid="http://schemas.microsoft.com/office/word/2016/wordml/cid" xmlns:w16="http://schemas.microsoft.com/office/word/2018/wordml" xmlns:w16du="http://schemas.microsoft.com/office/word/2023/wordml/word16du" xmlns:w16sdtdh="http://schemas.microsoft.com/office/word/2020/wordml/sdtdatahash" xmlns:w16se="http://schemas.microsoft.com/office/word/2015/wordml/symex" xmlns:wpg="http://schemas.microsoft.com/office/word/2010/wordprocessingGroup" xmlns:wpi="http://schemas.microsoft.com/office/word/2010/wordprocessingInk" xmlns:wne="http://schemas.microsoft.com/office/word/2006/wordml" xmlns:wps="http://schemas.microsoft.com/office/word/2010/wordprocessingShape" mc:Ignorable="w14 w15 w16se w16cid w16 w16cex w16sdtdh w16du wp14">
+<w:document xmlns:wpc="http://schemas.microsoft.com/office/word/2010/wordprocessingCanvas" xmlns:cx="http://schemas.microsoft.com/office/drawing/2014/chartex" xmlns:cx1="http://schemas.microsoft.com/office/drawing/2015/9/8/chartex" xmlns:cx2="http://schemas.microsoft.com/office/drawing/2015/10/21/chartex" xmlns:cx3="http://schemas.microsoft.com/office/drawing/2016/5/9/chartex" xmlns:cx4="http://schemas.microsoft.com/office/drawing/2016/5/10/chartex" xmlns:cx5="http://schemas.microsoft.com/office/drawing/2016/5/11/chartex" xmlns:cx6="http://schemas.microsoft.com/office/drawing/2016/5/12/chartex" xmlns:cx7="http://schemas.microsoft.com/office/drawing/2016/5/13/chartex" xmlns:cx8="http://schemas.microsoft.com/office/drawing/2016/5/14/chartex" xmlns:mc="http://schemas.openxmlformats.org/markup-compatibility/2006" xmlns:aink="http://schemas.microsoft.com/office/drawing/2016/ink" xmlns:am3d="http://schemas.microsoft.com/office/drawing/2017/model3d" xmlns:o="urn:schemas-microsoft-com:office:office" xmlns:oel="http://schemas.microsoft.com/office/2019/extlst" xmlns:r="http://schemas.openxmlformats.org/officeDocument/2006/relationships" xmlns:m="http://schemas.openxmlformats.org/officeDocument/2006/math" xmlns:v="urn:schemas-microsoft-com:vml" xmlns:wp14="http://schemas.microsoft.com/office/word/2010/wordprocessingDrawing" xmlns:wp="http://schemas.openxmlformats.org/drawingml/2006/wordprocessingDrawing" xmlns:w10="urn:schemas-microsoft-com:office:word" xmlns:w="http://schemas.openxmlformats.org/wordprocessingml/2006/main" xmlns:w14="http://schemas.microsoft.com/office/word/2010/wordml" xmlns:w15="http://schemas.microsoft.com/office/word/2012/wordml" xmlns:w16cex="http://schemas.microsoft.com/office/word/2018/wordml/cex" xmlns:w16cid="http://schemas.microsoft.com/office/word/2016/wordml/cid" xmlns:w16="http://schemas.microsoft.com/office/word/2018/wordml" xmlns:w16du="http://schemas.microsoft.com/office/word/2023/wordml/word16du" xmlns:w16sdtdh="http://schemas.microsoft.com/office/word/2020/wordml/sdtdatahash" xmlns:w16sdtfl="http://schemas.microsoft.com/office/word/2024/wordml/sdtformatlock" xmlns:w16se="http://schemas.microsoft.com/office/word/2015/wordml/symex" xmlns:wpg="http://schemas.microsoft.com/office/word/2010/wordprocessingGroup" xmlns:wpi="http://schemas.microsoft.com/office/word/2010/wordprocessingInk" xmlns:wne="http://schemas.microsoft.com/office/word/2006/wordml" xmlns:wps="http://schemas.microsoft.com/office/word/2010/wordprocessingShape" mc:Ignorable="w14 w15 w16se w16cid w16 w16cex w16sdtdh w16sdtfl w16du wp14">
   <w:body>
     <w:p>
       <w:pPr>
         <w:shd w:val="clear" w:color="auto" w:fill="FFFFFF" w:themeFill="background1"/>
+        <w:tabs>
+          <w:tab w:val="left" w:pos="284"/>
+        </w:tabs>
         <w:spacing w:line="360" w:lineRule="auto"/>
         <w:jc w:val="center"/>
         <w:rPr>
@@ -28,6 +31,9 @@
     </w:p>
     <w:p>
       <w:pPr>
+        <w:tabs>
+          <w:tab w:val="left" w:pos="284"/>
+        </w:tabs>
         <w:spacing w:line="360" w:lineRule="auto"/>
         <w:jc w:val="center"/>
         <w:rPr>
@@ -52,6 +58,7 @@
     <w:p>
       <w:pPr>
         <w:tabs>
+          <w:tab w:val="left" w:pos="284"/>
           <w:tab w:val="center" w:pos="4985"/>
         </w:tabs>
         <w:spacing w:before="120" w:after="120" w:line="360" w:lineRule="auto"/>
@@ -123,6 +130,9 @@
     </w:p>
     <w:p>
       <w:pPr>
+        <w:tabs>
+          <w:tab w:val="left" w:pos="284"/>
+        </w:tabs>
         <w:spacing w:line="360" w:lineRule="auto"/>
         <w:jc w:val="center"/>
         <w:rPr>
@@ -188,6 +198,9 @@
     </w:p>
     <w:p>
       <w:pPr>
+        <w:tabs>
+          <w:tab w:val="left" w:pos="284"/>
+        </w:tabs>
         <w:spacing w:line="360" w:lineRule="auto"/>
         <w:jc w:val="center"/>
         <w:rPr>
@@ -199,6 +212,9 @@
     </w:p>
     <w:p>
       <w:pPr>
+        <w:tabs>
+          <w:tab w:val="left" w:pos="284"/>
+        </w:tabs>
         <w:spacing w:line="360" w:lineRule="auto"/>
         <w:jc w:val="center"/>
         <w:rPr>
@@ -225,6 +241,7 @@
         <w:pStyle w:val="Vnbnnidung40"/>
         <w:shd w:val="clear" w:color="auto" w:fill="auto"/>
         <w:tabs>
+          <w:tab w:val="left" w:pos="284"/>
           <w:tab w:val="left" w:pos="2790"/>
           <w:tab w:val="left" w:pos="3150"/>
         </w:tabs>
@@ -244,6 +261,7 @@
         <w:pStyle w:val="Vnbnnidung40"/>
         <w:shd w:val="clear" w:color="auto" w:fill="auto"/>
         <w:tabs>
+          <w:tab w:val="left" w:pos="284"/>
           <w:tab w:val="left" w:pos="2790"/>
           <w:tab w:val="left" w:pos="3150"/>
         </w:tabs>
@@ -311,6 +329,7 @@
         <w:pStyle w:val="Vnbnnidung40"/>
         <w:shd w:val="clear" w:color="auto" w:fill="auto"/>
         <w:tabs>
+          <w:tab w:val="left" w:pos="284"/>
           <w:tab w:val="left" w:pos="2790"/>
           <w:tab w:val="left" w:pos="3150"/>
         </w:tabs>
@@ -332,6 +351,9 @@
     </w:p>
     <w:p>
       <w:pPr>
+        <w:tabs>
+          <w:tab w:val="left" w:pos="284"/>
+        </w:tabs>
         <w:spacing w:after="0" w:line="240" w:lineRule="auto"/>
         <w:jc w:val="center"/>
         <w:textAlignment w:val="baseline"/>
@@ -346,6 +368,9 @@
     </w:p>
     <w:p>
       <w:pPr>
+        <w:tabs>
+          <w:tab w:val="left" w:pos="284"/>
+        </w:tabs>
         <w:spacing w:after="0" w:line="240" w:lineRule="auto"/>
         <w:jc w:val="center"/>
         <w:textAlignment w:val="baseline"/>
@@ -360,6 +385,9 @@
     </w:p>
     <w:p>
       <w:pPr>
+        <w:tabs>
+          <w:tab w:val="left" w:pos="284"/>
+        </w:tabs>
         <w:spacing w:after="0" w:line="240" w:lineRule="auto"/>
         <w:jc w:val="center"/>
         <w:textAlignment w:val="baseline"/>
@@ -374,6 +402,9 @@
     </w:p>
     <w:p>
       <w:pPr>
+        <w:tabs>
+          <w:tab w:val="left" w:pos="284"/>
+        </w:tabs>
         <w:spacing w:after="0" w:line="240" w:lineRule="auto"/>
         <w:jc w:val="center"/>
         <w:textAlignment w:val="baseline"/>
@@ -391,6 +422,7 @@
         <w:pStyle w:val="Vnbnnidung40"/>
         <w:shd w:val="clear" w:color="auto" w:fill="auto"/>
         <w:tabs>
+          <w:tab w:val="left" w:pos="284"/>
           <w:tab w:val="left" w:pos="2790"/>
           <w:tab w:val="left" w:pos="3150"/>
         </w:tabs>
@@ -419,6 +451,7 @@
         <w:pStyle w:val="Vnbnnidung40"/>
         <w:shd w:val="clear" w:color="auto" w:fill="auto"/>
         <w:tabs>
+          <w:tab w:val="left" w:pos="284"/>
           <w:tab w:val="left" w:pos="2790"/>
           <w:tab w:val="left" w:pos="3150"/>
         </w:tabs>
@@ -460,6 +493,7 @@
         <w:pStyle w:val="Vnbnnidung40"/>
         <w:shd w:val="clear" w:color="auto" w:fill="auto"/>
         <w:tabs>
+          <w:tab w:val="left" w:pos="284"/>
           <w:tab w:val="left" w:pos="2790"/>
           <w:tab w:val="left" w:pos="3150"/>
         </w:tabs>
@@ -497,6 +531,7 @@
         <w:pStyle w:val="Vnbnnidung40"/>
         <w:shd w:val="clear" w:color="auto" w:fill="auto"/>
         <w:tabs>
+          <w:tab w:val="left" w:pos="284"/>
           <w:tab w:val="left" w:pos="2790"/>
           <w:tab w:val="left" w:pos="3150"/>
         </w:tabs>
@@ -549,6 +584,7 @@
         <w:pStyle w:val="Vnbnnidung40"/>
         <w:shd w:val="clear" w:color="auto" w:fill="auto"/>
         <w:tabs>
+          <w:tab w:val="left" w:pos="284"/>
           <w:tab w:val="left" w:pos="2790"/>
           <w:tab w:val="left" w:pos="3150"/>
         </w:tabs>
@@ -586,6 +622,7 @@
         <w:pStyle w:val="Vnbnnidung40"/>
         <w:shd w:val="clear" w:color="auto" w:fill="auto"/>
         <w:tabs>
+          <w:tab w:val="left" w:pos="284"/>
           <w:tab w:val="left" w:pos="2790"/>
           <w:tab w:val="left" w:pos="3150"/>
         </w:tabs>
@@ -603,6 +640,7 @@
         <w:pStyle w:val="Vnbnnidung40"/>
         <w:shd w:val="clear" w:color="auto" w:fill="auto"/>
         <w:tabs>
+          <w:tab w:val="left" w:pos="284"/>
           <w:tab w:val="left" w:pos="2790"/>
           <w:tab w:val="left" w:pos="3150"/>
         </w:tabs>
@@ -631,6 +669,7 @@
         <w:pStyle w:val="Vnbnnidung40"/>
         <w:shd w:val="clear" w:color="auto" w:fill="auto"/>
         <w:tabs>
+          <w:tab w:val="left" w:pos="284"/>
           <w:tab w:val="left" w:pos="2790"/>
           <w:tab w:val="left" w:pos="3150"/>
         </w:tabs>
@@ -659,6 +698,7 @@
         <w:pStyle w:val="Vnbnnidung40"/>
         <w:shd w:val="clear" w:color="auto" w:fill="auto"/>
         <w:tabs>
+          <w:tab w:val="left" w:pos="284"/>
           <w:tab w:val="left" w:pos="2790"/>
           <w:tab w:val="left" w:pos="3150"/>
         </w:tabs>
@@ -674,6 +714,9 @@
     <w:p>
       <w:pPr>
         <w:pStyle w:val="paragraph"/>
+        <w:tabs>
+          <w:tab w:val="left" w:pos="284"/>
+        </w:tabs>
         <w:spacing w:before="0" w:beforeAutospacing="0" w:after="0" w:afterAutospacing="0"/>
         <w:textAlignment w:val="baseline"/>
         <w:rPr>
@@ -686,6 +729,9 @@
     <w:p>
       <w:pPr>
         <w:shd w:val="clear" w:color="auto" w:fill="FFFFFF" w:themeFill="background1"/>
+        <w:tabs>
+          <w:tab w:val="left" w:pos="284"/>
+        </w:tabs>
         <w:spacing w:line="360" w:lineRule="auto"/>
         <w:jc w:val="center"/>
         <w:rPr>
@@ -745,6 +791,9 @@
       <w:sdtContent>
         <w:p>
           <w:pPr>
+            <w:tabs>
+              <w:tab w:val="left" w:pos="284"/>
+            </w:tabs>
             <w:spacing w:after="0" w:line="240" w:lineRule="auto"/>
             <w:jc w:val="center"/>
           </w:pPr>
@@ -760,6 +809,7 @@
           <w:pPr>
             <w:pStyle w:val="WPSOffice1"/>
             <w:tabs>
+              <w:tab w:val="left" w:pos="284"/>
               <w:tab w:val="right" w:leader="dot" w:pos="9072"/>
             </w:tabs>
             <w:rPr>
@@ -826,6 +876,7 @@
           <w:pPr>
             <w:pStyle w:val="WPSOffice1"/>
             <w:tabs>
+              <w:tab w:val="left" w:pos="284"/>
               <w:tab w:val="right" w:leader="dot" w:pos="9072"/>
             </w:tabs>
             <w:rPr>
@@ -883,6 +934,7 @@
           <w:pPr>
             <w:pStyle w:val="WPSOffice1"/>
             <w:tabs>
+              <w:tab w:val="left" w:pos="284"/>
               <w:tab w:val="right" w:leader="dot" w:pos="9072"/>
             </w:tabs>
             <w:rPr>
@@ -940,6 +992,7 @@
           <w:pPr>
             <w:pStyle w:val="WPSOffice2"/>
             <w:tabs>
+              <w:tab w:val="left" w:pos="284"/>
               <w:tab w:val="right" w:leader="dot" w:pos="9072"/>
             </w:tabs>
             <w:ind w:left="480"/>
@@ -998,6 +1051,7 @@
           <w:pPr>
             <w:pStyle w:val="WPSOffice2"/>
             <w:tabs>
+              <w:tab w:val="left" w:pos="284"/>
               <w:tab w:val="right" w:leader="dot" w:pos="9072"/>
             </w:tabs>
             <w:ind w:left="480"/>
@@ -1056,6 +1110,7 @@
           <w:pPr>
             <w:pStyle w:val="WPSOffice1"/>
             <w:tabs>
+              <w:tab w:val="left" w:pos="284"/>
               <w:tab w:val="right" w:leader="dot" w:pos="9072"/>
             </w:tabs>
             <w:rPr>
@@ -1114,6 +1169,7 @@
           <w:pPr>
             <w:pStyle w:val="WPSOffice1"/>
             <w:tabs>
+              <w:tab w:val="left" w:pos="284"/>
               <w:tab w:val="right" w:leader="dot" w:pos="9072"/>
             </w:tabs>
             <w:rPr>
@@ -1171,6 +1227,7 @@
           <w:pPr>
             <w:pStyle w:val="WPSOffice2"/>
             <w:tabs>
+              <w:tab w:val="left" w:pos="284"/>
               <w:tab w:val="right" w:leader="dot" w:pos="9072"/>
             </w:tabs>
             <w:ind w:left="480"/>
@@ -1238,6 +1295,7 @@
           <w:pPr>
             <w:pStyle w:val="WPSOffice2"/>
             <w:tabs>
+              <w:tab w:val="left" w:pos="284"/>
               <w:tab w:val="right" w:leader="dot" w:pos="9072"/>
             </w:tabs>
             <w:ind w:left="480"/>
@@ -1312,6 +1370,7 @@
           <w:pPr>
             <w:pStyle w:val="WPSOffice2"/>
             <w:tabs>
+              <w:tab w:val="left" w:pos="284"/>
               <w:tab w:val="right" w:leader="dot" w:pos="9072"/>
             </w:tabs>
             <w:ind w:left="480"/>
@@ -1393,6 +1452,7 @@
           <w:pPr>
             <w:pStyle w:val="WPSOffice2"/>
             <w:tabs>
+              <w:tab w:val="left" w:pos="284"/>
               <w:tab w:val="right" w:leader="dot" w:pos="9072"/>
             </w:tabs>
             <w:ind w:left="480"/>
@@ -1467,6 +1527,7 @@
           <w:pPr>
             <w:pStyle w:val="WPSOffice2"/>
             <w:tabs>
+              <w:tab w:val="left" w:pos="284"/>
               <w:tab w:val="right" w:leader="dot" w:pos="9072"/>
             </w:tabs>
             <w:ind w:left="480"/>
@@ -1536,6 +1597,7 @@
           <w:pPr>
             <w:pStyle w:val="WPSOffice2"/>
             <w:tabs>
+              <w:tab w:val="left" w:pos="284"/>
               <w:tab w:val="right" w:leader="dot" w:pos="9072"/>
             </w:tabs>
             <w:ind w:left="480"/>
@@ -1614,6 +1676,11 @@
           </w:hyperlink>
         </w:p>
         <w:p>
+          <w:pPr>
+            <w:tabs>
+              <w:tab w:val="left" w:pos="284"/>
+            </w:tabs>
+          </w:pPr>
           <w:r>
             <w:fldChar w:fldCharType="end"/>
           </w:r>
@@ -1622,6 +1689,9 @@
     </w:sdt>
     <w:p>
       <w:pPr>
+        <w:tabs>
+          <w:tab w:val="left" w:pos="284"/>
+        </w:tabs>
         <w:rPr>
           <w:rFonts w:eastAsiaTheme="majorEastAsia" w:cs="Times New Roman"/>
           <w:color w:val="0F4761" w:themeColor="accent1" w:themeShade="BF"/>
@@ -1641,6 +1711,9 @@
     <w:p>
       <w:pPr>
         <w:pStyle w:val="Heading1"/>
+        <w:tabs>
+          <w:tab w:val="left" w:pos="284"/>
+        </w:tabs>
         <w:jc w:val="center"/>
         <w:rPr>
           <w:rFonts w:ascii="Times New Roman" w:hAnsi="Times New Roman" w:cs="Times New Roman"/>
@@ -1693,6 +1766,9 @@
           </w:tcPr>
           <w:p>
             <w:pPr>
+              <w:tabs>
+                <w:tab w:val="left" w:pos="284"/>
+              </w:tabs>
               <w:rPr>
                 <w:rFonts w:cs="Times New Roman"/>
               </w:rPr>
@@ -1706,6 +1782,9 @@
           </w:tcPr>
           <w:p>
             <w:pPr>
+              <w:tabs>
+                <w:tab w:val="left" w:pos="284"/>
+              </w:tabs>
               <w:jc w:val="center"/>
               <w:rPr>
                 <w:rFonts w:cs="Times New Roman"/>
@@ -1728,6 +1807,9 @@
           </w:tcPr>
           <w:p>
             <w:pPr>
+              <w:tabs>
+                <w:tab w:val="left" w:pos="284"/>
+              </w:tabs>
               <w:jc w:val="center"/>
               <w:rPr>
                 <w:rFonts w:cs="Times New Roman"/>
@@ -1750,6 +1832,9 @@
           </w:tcPr>
           <w:p>
             <w:pPr>
+              <w:tabs>
+                <w:tab w:val="left" w:pos="284"/>
+              </w:tabs>
               <w:jc w:val="center"/>
               <w:rPr>
                 <w:rFonts w:cs="Times New Roman"/>
@@ -1772,6 +1857,9 @@
           </w:tcPr>
           <w:p>
             <w:pPr>
+              <w:tabs>
+                <w:tab w:val="left" w:pos="284"/>
+              </w:tabs>
               <w:jc w:val="center"/>
               <w:rPr>
                 <w:rFonts w:cs="Times New Roman"/>
@@ -1801,6 +1889,9 @@
           </w:tcPr>
           <w:p>
             <w:pPr>
+              <w:tabs>
+                <w:tab w:val="left" w:pos="284"/>
+              </w:tabs>
               <w:rPr>
                 <w:rFonts w:cs="Times New Roman"/>
               </w:rPr>
@@ -1823,6 +1914,9 @@
           </w:tcPr>
           <w:p>
             <w:pPr>
+              <w:tabs>
+                <w:tab w:val="left" w:pos="284"/>
+              </w:tabs>
               <w:jc w:val="center"/>
               <w:rPr>
                 <w:rFonts w:cs="Times New Roman"/>
@@ -1845,6 +1939,9 @@
           </w:tcPr>
           <w:p>
             <w:pPr>
+              <w:tabs>
+                <w:tab w:val="left" w:pos="284"/>
+              </w:tabs>
               <w:jc w:val="center"/>
               <w:rPr>
                 <w:rFonts w:cs="Times New Roman"/>
@@ -1871,6 +1968,9 @@
           </w:tcPr>
           <w:p>
             <w:pPr>
+              <w:tabs>
+                <w:tab w:val="left" w:pos="284"/>
+              </w:tabs>
               <w:jc w:val="center"/>
               <w:rPr>
                 <w:rFonts w:cs="Times New Roman"/>
@@ -1893,6 +1993,9 @@
           </w:tcPr>
           <w:p>
             <w:pPr>
+              <w:tabs>
+                <w:tab w:val="left" w:pos="284"/>
+              </w:tabs>
               <w:jc w:val="center"/>
               <w:rPr>
                 <w:rFonts w:cs="Times New Roman"/>
@@ -1922,6 +2025,9 @@
           </w:tcPr>
           <w:p>
             <w:pPr>
+              <w:tabs>
+                <w:tab w:val="left" w:pos="284"/>
+              </w:tabs>
               <w:rPr>
                 <w:rFonts w:cs="Times New Roman"/>
               </w:rPr>
@@ -1944,6 +2050,9 @@
           </w:tcPr>
           <w:p>
             <w:pPr>
+              <w:tabs>
+                <w:tab w:val="left" w:pos="284"/>
+              </w:tabs>
               <w:jc w:val="center"/>
               <w:rPr>
                 <w:rFonts w:cs="Times New Roman"/>
@@ -1964,6 +2073,9 @@
           </w:tcPr>
           <w:p>
             <w:pPr>
+              <w:tabs>
+                <w:tab w:val="left" w:pos="284"/>
+              </w:tabs>
               <w:jc w:val="center"/>
               <w:rPr>
                 <w:rFonts w:cs="Times New Roman"/>
@@ -1990,6 +2102,9 @@
           </w:tcPr>
           <w:p>
             <w:pPr>
+              <w:tabs>
+                <w:tab w:val="left" w:pos="284"/>
+              </w:tabs>
               <w:jc w:val="center"/>
               <w:rPr>
                 <w:rFonts w:cs="Times New Roman"/>
@@ -2016,6 +2131,9 @@
           </w:tcPr>
           <w:p>
             <w:pPr>
+              <w:tabs>
+                <w:tab w:val="left" w:pos="284"/>
+              </w:tabs>
               <w:jc w:val="center"/>
               <w:rPr>
                 <w:rFonts w:cs="Times New Roman"/>
@@ -2049,6 +2167,9 @@
           </w:tcPr>
           <w:p>
             <w:pPr>
+              <w:tabs>
+                <w:tab w:val="left" w:pos="284"/>
+              </w:tabs>
               <w:rPr>
                 <w:rFonts w:cs="Times New Roman"/>
               </w:rPr>
@@ -2071,6 +2192,9 @@
           </w:tcPr>
           <w:p>
             <w:pPr>
+              <w:tabs>
+                <w:tab w:val="left" w:pos="284"/>
+              </w:tabs>
               <w:jc w:val="center"/>
               <w:rPr>
                 <w:rFonts w:cs="Times New Roman"/>
@@ -2091,6 +2215,9 @@
           </w:tcPr>
           <w:p>
             <w:pPr>
+              <w:tabs>
+                <w:tab w:val="left" w:pos="284"/>
+              </w:tabs>
               <w:jc w:val="center"/>
               <w:rPr>
                 <w:rFonts w:cs="Times New Roman"/>
@@ -2123,6 +2250,9 @@
           </w:tcPr>
           <w:p>
             <w:pPr>
+              <w:tabs>
+                <w:tab w:val="left" w:pos="284"/>
+              </w:tabs>
               <w:jc w:val="center"/>
               <w:rPr>
                 <w:rFonts w:cs="Times New Roman"/>
@@ -2143,6 +2273,9 @@
           </w:tcPr>
           <w:p>
             <w:pPr>
+              <w:tabs>
+                <w:tab w:val="left" w:pos="284"/>
+              </w:tabs>
               <w:jc w:val="center"/>
               <w:rPr>
                 <w:rFonts w:cs="Times New Roman"/>
@@ -2170,6 +2303,9 @@
           </w:tcPr>
           <w:p>
             <w:pPr>
+              <w:tabs>
+                <w:tab w:val="left" w:pos="284"/>
+              </w:tabs>
               <w:rPr>
                 <w:rFonts w:cs="Times New Roman"/>
               </w:rPr>
@@ -2192,6 +2328,9 @@
           </w:tcPr>
           <w:p>
             <w:pPr>
+              <w:tabs>
+                <w:tab w:val="left" w:pos="284"/>
+              </w:tabs>
               <w:jc w:val="center"/>
               <w:rPr>
                 <w:rFonts w:cs="Times New Roman"/>
@@ -2212,6 +2351,9 @@
           </w:tcPr>
           <w:p>
             <w:pPr>
+              <w:tabs>
+                <w:tab w:val="left" w:pos="284"/>
+              </w:tabs>
               <w:jc w:val="center"/>
               <w:rPr>
                 <w:rFonts w:cs="Times New Roman"/>
@@ -2232,6 +2374,9 @@
           </w:tcPr>
           <w:p>
             <w:pPr>
+              <w:tabs>
+                <w:tab w:val="left" w:pos="284"/>
+              </w:tabs>
               <w:jc w:val="center"/>
               <w:rPr>
                 <w:rFonts w:cs="Times New Roman"/>
@@ -2252,6 +2397,9 @@
           </w:tcPr>
           <w:p>
             <w:pPr>
+              <w:tabs>
+                <w:tab w:val="left" w:pos="284"/>
+              </w:tabs>
               <w:jc w:val="center"/>
               <w:rPr>
                 <w:rFonts w:cs="Times New Roman"/>
@@ -2279,6 +2427,9 @@
           </w:tcPr>
           <w:p>
             <w:pPr>
+              <w:tabs>
+                <w:tab w:val="left" w:pos="284"/>
+              </w:tabs>
               <w:rPr>
                 <w:rFonts w:cs="Times New Roman"/>
               </w:rPr>
@@ -2301,6 +2452,9 @@
           </w:tcPr>
           <w:p>
             <w:pPr>
+              <w:tabs>
+                <w:tab w:val="left" w:pos="284"/>
+              </w:tabs>
               <w:jc w:val="center"/>
               <w:rPr>
                 <w:rFonts w:cs="Times New Roman"/>
@@ -2321,6 +2475,9 @@
           </w:tcPr>
           <w:p>
             <w:pPr>
+              <w:tabs>
+                <w:tab w:val="left" w:pos="284"/>
+              </w:tabs>
               <w:jc w:val="center"/>
               <w:rPr>
                 <w:rFonts w:cs="Times New Roman"/>
@@ -2341,6 +2498,9 @@
           </w:tcPr>
           <w:p>
             <w:pPr>
+              <w:tabs>
+                <w:tab w:val="left" w:pos="284"/>
+              </w:tabs>
               <w:jc w:val="center"/>
               <w:rPr>
                 <w:rFonts w:cs="Times New Roman"/>
@@ -2361,6 +2521,9 @@
           </w:tcPr>
           <w:p>
             <w:pPr>
+              <w:tabs>
+                <w:tab w:val="left" w:pos="284"/>
+              </w:tabs>
               <w:jc w:val="center"/>
               <w:rPr>
                 <w:rFonts w:cs="Times New Roman"/>
@@ -2388,6 +2551,9 @@
           </w:tcPr>
           <w:p>
             <w:pPr>
+              <w:tabs>
+                <w:tab w:val="left" w:pos="284"/>
+              </w:tabs>
               <w:rPr>
                 <w:rFonts w:cs="Times New Roman"/>
               </w:rPr>
@@ -2410,6 +2576,9 @@
           </w:tcPr>
           <w:p>
             <w:pPr>
+              <w:tabs>
+                <w:tab w:val="left" w:pos="284"/>
+              </w:tabs>
               <w:jc w:val="center"/>
               <w:rPr>
                 <w:rFonts w:cs="Times New Roman"/>
@@ -2430,6 +2599,9 @@
           </w:tcPr>
           <w:p>
             <w:pPr>
+              <w:tabs>
+                <w:tab w:val="left" w:pos="284"/>
+              </w:tabs>
               <w:jc w:val="center"/>
               <w:rPr>
                 <w:rFonts w:cs="Times New Roman"/>
@@ -2450,6 +2622,9 @@
           </w:tcPr>
           <w:p>
             <w:pPr>
+              <w:tabs>
+                <w:tab w:val="left" w:pos="284"/>
+              </w:tabs>
               <w:jc w:val="center"/>
               <w:rPr>
                 <w:rFonts w:cs="Times New Roman"/>
@@ -2470,6 +2645,9 @@
           </w:tcPr>
           <w:p>
             <w:pPr>
+              <w:tabs>
+                <w:tab w:val="left" w:pos="284"/>
+              </w:tabs>
               <w:jc w:val="center"/>
               <w:rPr>
                 <w:rFonts w:cs="Times New Roman"/>
@@ -2497,6 +2675,9 @@
           </w:tcPr>
           <w:p>
             <w:pPr>
+              <w:tabs>
+                <w:tab w:val="left" w:pos="284"/>
+              </w:tabs>
               <w:rPr>
                 <w:rFonts w:cs="Times New Roman"/>
               </w:rPr>
@@ -2519,6 +2700,9 @@
           </w:tcPr>
           <w:p>
             <w:pPr>
+              <w:tabs>
+                <w:tab w:val="left" w:pos="284"/>
+              </w:tabs>
               <w:jc w:val="center"/>
               <w:rPr>
                 <w:rFonts w:cs="Times New Roman"/>
@@ -2539,6 +2723,9 @@
           </w:tcPr>
           <w:p>
             <w:pPr>
+              <w:tabs>
+                <w:tab w:val="left" w:pos="284"/>
+              </w:tabs>
               <w:jc w:val="center"/>
               <w:rPr>
                 <w:rFonts w:cs="Times New Roman"/>
@@ -2559,6 +2746,9 @@
           </w:tcPr>
           <w:p>
             <w:pPr>
+              <w:tabs>
+                <w:tab w:val="left" w:pos="284"/>
+              </w:tabs>
               <w:jc w:val="center"/>
               <w:rPr>
                 <w:rFonts w:cs="Times New Roman"/>
@@ -2585,6 +2775,9 @@
           </w:tcPr>
           <w:p>
             <w:pPr>
+              <w:tabs>
+                <w:tab w:val="left" w:pos="284"/>
+              </w:tabs>
               <w:jc w:val="center"/>
               <w:rPr>
                 <w:rFonts w:cs="Times New Roman"/>
@@ -2612,6 +2805,9 @@
           </w:tcPr>
           <w:p>
             <w:pPr>
+              <w:tabs>
+                <w:tab w:val="left" w:pos="284"/>
+              </w:tabs>
               <w:rPr>
                 <w:rFonts w:cs="Times New Roman"/>
               </w:rPr>
@@ -2634,6 +2830,9 @@
           </w:tcPr>
           <w:p>
             <w:pPr>
+              <w:tabs>
+                <w:tab w:val="left" w:pos="284"/>
+              </w:tabs>
               <w:jc w:val="center"/>
               <w:rPr>
                 <w:rFonts w:cs="Times New Roman"/>
@@ -2654,6 +2853,9 @@
           </w:tcPr>
           <w:p>
             <w:pPr>
+              <w:tabs>
+                <w:tab w:val="left" w:pos="284"/>
+              </w:tabs>
               <w:jc w:val="center"/>
               <w:rPr>
                 <w:rFonts w:cs="Times New Roman"/>
@@ -2674,6 +2876,9 @@
           </w:tcPr>
           <w:p>
             <w:pPr>
+              <w:tabs>
+                <w:tab w:val="left" w:pos="284"/>
+              </w:tabs>
               <w:jc w:val="center"/>
               <w:rPr>
                 <w:rFonts w:cs="Times New Roman"/>
@@ -2701,6 +2906,9 @@
           </w:tcPr>
           <w:p>
             <w:pPr>
+              <w:tabs>
+                <w:tab w:val="left" w:pos="284"/>
+              </w:tabs>
               <w:jc w:val="center"/>
               <w:rPr>
                 <w:rFonts w:cs="Times New Roman"/>
@@ -2729,6 +2937,9 @@
           </w:tcPr>
           <w:p>
             <w:pPr>
+              <w:tabs>
+                <w:tab w:val="left" w:pos="284"/>
+              </w:tabs>
               <w:rPr>
                 <w:rFonts w:cs="Times New Roman"/>
               </w:rPr>
@@ -2751,6 +2962,9 @@
           </w:tcPr>
           <w:p>
             <w:pPr>
+              <w:tabs>
+                <w:tab w:val="left" w:pos="284"/>
+              </w:tabs>
               <w:jc w:val="center"/>
               <w:rPr>
                 <w:rFonts w:cs="Times New Roman"/>
@@ -2760,31 +2974,7 @@
               <w:rPr>
                 <w:rFonts w:cs="Times New Roman"/>
               </w:rPr>
-              <w:t>THỦ TỤC TÍNH TỔNG</w:t>
-            </w:r>
-            <w:r>
-              <w:rPr>
-                <w:rFonts w:cs="Times New Roman"/>
-              </w:rPr>
-              <w:t xml:space="preserve"> TIỀ</w:t>
-            </w:r>
-            <w:r>
-              <w:rPr>
-                <w:rFonts w:cs="Times New Roman"/>
-              </w:rPr>
-              <w:t>N</w:t>
-            </w:r>
-            <w:r>
-              <w:rPr>
-                <w:rFonts w:cs="Times New Roman"/>
-              </w:rPr>
-              <w:t xml:space="preserve"> CỦA THI HÀI</w:t>
-            </w:r>
-            <w:r>
-              <w:rPr>
-                <w:rFonts w:cs="Times New Roman"/>
-              </w:rPr>
-              <w:t>, THỦ TỤC BÁC SĨ LÃO LUYỆN</w:t>
+              <w:t>THỦ TỤC BÁC SĨ LÃO LUYỆN</w:t>
             </w:r>
           </w:p>
         </w:tc>
@@ -2795,6 +2985,9 @@
           </w:tcPr>
           <w:p>
             <w:pPr>
+              <w:tabs>
+                <w:tab w:val="left" w:pos="284"/>
+              </w:tabs>
               <w:jc w:val="center"/>
               <w:rPr>
                 <w:rFonts w:cs="Times New Roman"/>
@@ -2821,6 +3014,9 @@
           </w:tcPr>
           <w:p>
             <w:pPr>
+              <w:tabs>
+                <w:tab w:val="left" w:pos="284"/>
+              </w:tabs>
               <w:jc w:val="center"/>
               <w:rPr>
                 <w:rFonts w:cs="Times New Roman"/>
@@ -2853,6 +3049,9 @@
           </w:tcPr>
           <w:p>
             <w:pPr>
+              <w:tabs>
+                <w:tab w:val="left" w:pos="284"/>
+              </w:tabs>
               <w:jc w:val="center"/>
               <w:rPr>
                 <w:rFonts w:cs="Times New Roman"/>
@@ -2880,6 +3079,9 @@
           </w:tcPr>
           <w:p>
             <w:pPr>
+              <w:tabs>
+                <w:tab w:val="left" w:pos="284"/>
+              </w:tabs>
               <w:rPr>
                 <w:rFonts w:cs="Times New Roman"/>
               </w:rPr>
@@ -2902,11 +3104,26 @@
           </w:tcPr>
           <w:p>
             <w:pPr>
+              <w:tabs>
+                <w:tab w:val="left" w:pos="284"/>
+              </w:tabs>
               <w:jc w:val="center"/>
               <w:rPr>
                 <w:rFonts w:cs="Times New Roman"/>
               </w:rPr>
             </w:pPr>
+            <w:r>
+              <w:rPr>
+                <w:rFonts w:cs="Times New Roman"/>
+              </w:rPr>
+              <w:t xml:space="preserve">TRIGGER </w:t>
+            </w:r>
+            <w:r>
+              <w:rPr>
+                <w:rFonts w:cs="Times New Roman"/>
+              </w:rPr>
+              <w:t>KIỂM TRA TRƯỞNG KHOA, TRIGGER TỰ ĐỘNG DỌN DẸP KHI XÓA THI HÀI</w:t>
+            </w:r>
           </w:p>
         </w:tc>
         <w:tc>
@@ -2916,11 +3133,20 @@
           </w:tcPr>
           <w:p>
             <w:pPr>
+              <w:tabs>
+                <w:tab w:val="left" w:pos="284"/>
+              </w:tabs>
               <w:jc w:val="center"/>
               <w:rPr>
                 <w:rFonts w:cs="Times New Roman"/>
               </w:rPr>
             </w:pPr>
+            <w:r>
+              <w:rPr>
+                <w:rFonts w:cs="Times New Roman"/>
+              </w:rPr>
+              <w:t>TRIGGER KIỂM TRA NGÀY KHÁM BỆNH, TRIGGER KIỂM TRA NGÀY SỬ DỤNG DỊCH VU</w:t>
+            </w:r>
           </w:p>
         </w:tc>
         <w:tc>
@@ -2930,11 +3156,20 @@
           </w:tcPr>
           <w:p>
             <w:pPr>
+              <w:tabs>
+                <w:tab w:val="left" w:pos="284"/>
+              </w:tabs>
               <w:jc w:val="center"/>
               <w:rPr>
                 <w:rFonts w:cs="Times New Roman"/>
               </w:rPr>
             </w:pPr>
+            <w:r>
+              <w:rPr>
+                <w:rFonts w:cs="Times New Roman"/>
+              </w:rPr>
+              <w:t>WORD, TRIGGER TỰ ĐỘNG ĐĂNG KÝ DỊCH VỤ, TRIGGER KIỂM SOÁT NHIỆT ĐỘ</w:t>
+            </w:r>
           </w:p>
         </w:tc>
         <w:tc>
@@ -2944,11 +3179,20 @@
           </w:tcPr>
           <w:p>
             <w:pPr>
+              <w:tabs>
+                <w:tab w:val="left" w:pos="284"/>
+              </w:tabs>
               <w:jc w:val="center"/>
               <w:rPr>
                 <w:rFonts w:cs="Times New Roman"/>
               </w:rPr>
             </w:pPr>
+            <w:r>
+              <w:rPr>
+                <w:rFonts w:cs="Times New Roman"/>
+              </w:rPr>
+              <w:t>TRIGGER BẢO TOÀN HỒ SƠ, TRIGGER GIỚI HẠN NĂNG SUẤT LÀM VIỆC CỦA BÁC SĨ</w:t>
+            </w:r>
           </w:p>
         </w:tc>
       </w:tr>
@@ -2965,6 +3209,9 @@
           </w:tcPr>
           <w:p>
             <w:pPr>
+              <w:tabs>
+                <w:tab w:val="left" w:pos="284"/>
+              </w:tabs>
               <w:rPr>
                 <w:rFonts w:cs="Times New Roman"/>
               </w:rPr>
@@ -2987,11 +3234,20 @@
           </w:tcPr>
           <w:p>
             <w:pPr>
+              <w:tabs>
+                <w:tab w:val="left" w:pos="284"/>
+              </w:tabs>
               <w:jc w:val="center"/>
               <w:rPr>
                 <w:rFonts w:cs="Times New Roman"/>
               </w:rPr>
             </w:pPr>
+            <w:r>
+              <w:rPr>
+                <w:rFonts w:cs="Times New Roman"/>
+              </w:rPr>
+              <w:t>HÀM TÍNH TỔNG TIỀN DỊCH VỤ THI HÀI, HÀM CẬP NHẬT TRẠNG THÁI NGĂN KÉO</w:t>
+            </w:r>
           </w:p>
         </w:tc>
         <w:tc>
@@ -3001,11 +3257,20 @@
           </w:tcPr>
           <w:p>
             <w:pPr>
+              <w:tabs>
+                <w:tab w:val="left" w:pos="284"/>
+              </w:tabs>
               <w:jc w:val="center"/>
               <w:rPr>
                 <w:rFonts w:cs="Times New Roman"/>
               </w:rPr>
             </w:pPr>
+            <w:r>
+              <w:rPr>
+                <w:rFonts w:cs="Times New Roman"/>
+              </w:rPr>
+              <w:t>HÀM TÌM KIẾM DỊCH VỤ TỬ THI, HÀM TÌM KIẾM TỬ THI DỰA TRÊN NGÀY</w:t>
+            </w:r>
           </w:p>
         </w:tc>
         <w:tc>
@@ -3015,11 +3280,26 @@
           </w:tcPr>
           <w:p>
             <w:pPr>
+              <w:tabs>
+                <w:tab w:val="left" w:pos="284"/>
+              </w:tabs>
               <w:jc w:val="center"/>
               <w:rPr>
                 <w:rFonts w:cs="Times New Roman"/>
               </w:rPr>
             </w:pPr>
+            <w:r>
+              <w:rPr>
+                <w:rFonts w:cs="Times New Roman"/>
+              </w:rPr>
+              <w:t xml:space="preserve">WORD, </w:t>
+            </w:r>
+            <w:r>
+              <w:rPr>
+                <w:rFonts w:cs="Times New Roman"/>
+              </w:rPr>
+              <w:t>HÀM TÌM NGĂN KÉO TRỐNG</w:t>
+            </w:r>
           </w:p>
         </w:tc>
         <w:tc>
@@ -3029,11 +3309,26 @@
           </w:tcPr>
           <w:p>
             <w:pPr>
+              <w:tabs>
+                <w:tab w:val="left" w:pos="284"/>
+              </w:tabs>
               <w:jc w:val="center"/>
               <w:rPr>
                 <w:rFonts w:cs="Times New Roman"/>
               </w:rPr>
             </w:pPr>
+            <w:r>
+              <w:rPr>
+                <w:rFonts w:cs="Times New Roman"/>
+              </w:rPr>
+              <w:t>HÀM LIỆT KÊ HỒ SƠ KHÁM NGHIỆM THEO BÁC SĨ</w:t>
+            </w:r>
+            <w:r>
+              <w:rPr>
+                <w:rFonts w:cs="Times New Roman"/>
+              </w:rPr>
+              <w:t>, HÀM LIỆT KÊ HỒ SƠ KHÁM NGHIỆM THEO TỬ THI</w:t>
+            </w:r>
           </w:p>
         </w:tc>
       </w:tr>
@@ -3050,6 +3345,9 @@
           </w:tcPr>
           <w:p>
             <w:pPr>
+              <w:tabs>
+                <w:tab w:val="left" w:pos="284"/>
+              </w:tabs>
               <w:rPr>
                 <w:rFonts w:cs="Times New Roman"/>
               </w:rPr>
@@ -3072,6 +3370,9 @@
           </w:tcPr>
           <w:p>
             <w:pPr>
+              <w:tabs>
+                <w:tab w:val="left" w:pos="284"/>
+              </w:tabs>
               <w:jc w:val="center"/>
               <w:rPr>
                 <w:rFonts w:cs="Times New Roman"/>
@@ -3086,6 +3387,9 @@
           </w:tcPr>
           <w:p>
             <w:pPr>
+              <w:tabs>
+                <w:tab w:val="left" w:pos="284"/>
+              </w:tabs>
               <w:jc w:val="center"/>
               <w:rPr>
                 <w:rFonts w:cs="Times New Roman"/>
@@ -3100,6 +3404,9 @@
           </w:tcPr>
           <w:p>
             <w:pPr>
+              <w:tabs>
+                <w:tab w:val="left" w:pos="284"/>
+              </w:tabs>
               <w:jc w:val="center"/>
               <w:rPr>
                 <w:rFonts w:cs="Times New Roman"/>
@@ -3114,6 +3421,9 @@
           </w:tcPr>
           <w:p>
             <w:pPr>
+              <w:tabs>
+                <w:tab w:val="left" w:pos="284"/>
+              </w:tabs>
               <w:jc w:val="center"/>
               <w:rPr>
                 <w:rFonts w:cs="Times New Roman"/>
@@ -3125,6 +3435,9 @@
     </w:tbl>
     <w:p>
       <w:pPr>
+        <w:tabs>
+          <w:tab w:val="left" w:pos="284"/>
+        </w:tabs>
         <w:rPr>
           <w:rFonts w:cs="Times New Roman"/>
         </w:rPr>
@@ -3138,6 +3451,9 @@
     </w:p>
     <w:p>
       <w:pPr>
+        <w:tabs>
+          <w:tab w:val="left" w:pos="284"/>
+        </w:tabs>
         <w:rPr>
           <w:rFonts w:cs="Times New Roman"/>
         </w:rPr>
@@ -3151,159 +3467,213 @@
     </w:p>
     <w:p>
       <w:pPr>
-        <w:rPr>
-          <w:rFonts w:cs="Times New Roman"/>
-          <w:b/>
-          <w:bCs/>
-        </w:rPr>
-      </w:pPr>
-    </w:p>
-    <w:p>
-      <w:pPr>
-        <w:rPr>
-          <w:rFonts w:cs="Times New Roman"/>
-          <w:b/>
-          <w:bCs/>
-        </w:rPr>
-      </w:pPr>
-    </w:p>
-    <w:p>
-      <w:pPr>
-        <w:rPr>
-          <w:rFonts w:cs="Times New Roman"/>
-          <w:b/>
-          <w:bCs/>
-        </w:rPr>
-      </w:pPr>
-    </w:p>
-    <w:p>
-      <w:pPr>
-        <w:rPr>
-          <w:rFonts w:cs="Times New Roman"/>
-          <w:b/>
-          <w:bCs/>
-        </w:rPr>
-      </w:pPr>
-    </w:p>
-    <w:p>
-      <w:pPr>
-        <w:rPr>
-          <w:rFonts w:cs="Times New Roman"/>
-          <w:b/>
-          <w:bCs/>
-        </w:rPr>
-      </w:pPr>
-    </w:p>
-    <w:p>
-      <w:pPr>
-        <w:rPr>
-          <w:rFonts w:cs="Times New Roman"/>
-          <w:b/>
-          <w:bCs/>
-        </w:rPr>
-      </w:pPr>
-    </w:p>
-    <w:p>
-      <w:pPr>
-        <w:rPr>
-          <w:rFonts w:cs="Times New Roman"/>
-          <w:b/>
-          <w:bCs/>
-        </w:rPr>
-      </w:pPr>
-    </w:p>
-    <w:p>
-      <w:pPr>
-        <w:rPr>
-          <w:rFonts w:cs="Times New Roman"/>
-          <w:b/>
-          <w:bCs/>
-        </w:rPr>
-      </w:pPr>
-    </w:p>
-    <w:p>
-      <w:pPr>
-        <w:rPr>
-          <w:rFonts w:cs="Times New Roman"/>
-          <w:b/>
-          <w:bCs/>
-        </w:rPr>
-      </w:pPr>
-    </w:p>
-    <w:p>
-      <w:pPr>
-        <w:rPr>
-          <w:rFonts w:cs="Times New Roman"/>
-          <w:b/>
-          <w:bCs/>
-        </w:rPr>
-      </w:pPr>
-    </w:p>
-    <w:p>
-      <w:pPr>
-        <w:rPr>
-          <w:rFonts w:cs="Times New Roman"/>
-          <w:b/>
-          <w:bCs/>
-        </w:rPr>
-      </w:pPr>
-    </w:p>
-    <w:p>
-      <w:pPr>
-        <w:rPr>
-          <w:rFonts w:cs="Times New Roman"/>
-          <w:b/>
-          <w:bCs/>
-        </w:rPr>
-      </w:pPr>
-    </w:p>
-    <w:p>
-      <w:pPr>
-        <w:rPr>
-          <w:rFonts w:cs="Times New Roman"/>
-          <w:b/>
-          <w:bCs/>
-        </w:rPr>
-      </w:pPr>
-    </w:p>
-    <w:p>
-      <w:pPr>
-        <w:rPr>
-          <w:rFonts w:cs="Times New Roman"/>
-          <w:b/>
-          <w:bCs/>
-        </w:rPr>
-      </w:pPr>
-    </w:p>
-    <w:p>
-      <w:pPr>
-        <w:rPr>
-          <w:rFonts w:cs="Times New Roman"/>
-          <w:b/>
-          <w:bCs/>
-        </w:rPr>
-      </w:pPr>
-    </w:p>
-    <w:p>
-      <w:pPr>
-        <w:rPr>
-          <w:rFonts w:cs="Times New Roman"/>
-          <w:b/>
-          <w:bCs/>
-        </w:rPr>
-      </w:pPr>
-    </w:p>
-    <w:p>
-      <w:pPr>
-        <w:rPr>
-          <w:rFonts w:cs="Times New Roman"/>
-          <w:b/>
-          <w:bCs/>
-        </w:rPr>
-      </w:pPr>
-    </w:p>
-    <w:p>
-      <w:pPr>
+        <w:tabs>
+          <w:tab w:val="left" w:pos="284"/>
+        </w:tabs>
+        <w:rPr>
+          <w:rFonts w:cs="Times New Roman"/>
+          <w:b/>
+          <w:bCs/>
+        </w:rPr>
+      </w:pPr>
+    </w:p>
+    <w:p>
+      <w:pPr>
+        <w:tabs>
+          <w:tab w:val="left" w:pos="284"/>
+        </w:tabs>
+        <w:rPr>
+          <w:rFonts w:cs="Times New Roman"/>
+          <w:b/>
+          <w:bCs/>
+        </w:rPr>
+      </w:pPr>
+    </w:p>
+    <w:p>
+      <w:pPr>
+        <w:tabs>
+          <w:tab w:val="left" w:pos="284"/>
+        </w:tabs>
+        <w:rPr>
+          <w:rFonts w:cs="Times New Roman"/>
+          <w:b/>
+          <w:bCs/>
+        </w:rPr>
+      </w:pPr>
+    </w:p>
+    <w:p>
+      <w:pPr>
+        <w:tabs>
+          <w:tab w:val="left" w:pos="284"/>
+        </w:tabs>
+        <w:rPr>
+          <w:rFonts w:cs="Times New Roman"/>
+          <w:b/>
+          <w:bCs/>
+        </w:rPr>
+      </w:pPr>
+    </w:p>
+    <w:p>
+      <w:pPr>
+        <w:tabs>
+          <w:tab w:val="left" w:pos="284"/>
+        </w:tabs>
+        <w:rPr>
+          <w:rFonts w:cs="Times New Roman"/>
+          <w:b/>
+          <w:bCs/>
+        </w:rPr>
+      </w:pPr>
+    </w:p>
+    <w:p>
+      <w:pPr>
+        <w:tabs>
+          <w:tab w:val="left" w:pos="284"/>
+        </w:tabs>
+        <w:rPr>
+          <w:rFonts w:cs="Times New Roman"/>
+          <w:b/>
+          <w:bCs/>
+        </w:rPr>
+      </w:pPr>
+    </w:p>
+    <w:p>
+      <w:pPr>
+        <w:tabs>
+          <w:tab w:val="left" w:pos="284"/>
+        </w:tabs>
+        <w:rPr>
+          <w:rFonts w:cs="Times New Roman"/>
+          <w:b/>
+          <w:bCs/>
+        </w:rPr>
+      </w:pPr>
+    </w:p>
+    <w:p>
+      <w:pPr>
+        <w:tabs>
+          <w:tab w:val="left" w:pos="284"/>
+        </w:tabs>
+        <w:rPr>
+          <w:rFonts w:cs="Times New Roman"/>
+          <w:b/>
+          <w:bCs/>
+        </w:rPr>
+      </w:pPr>
+    </w:p>
+    <w:p>
+      <w:pPr>
+        <w:tabs>
+          <w:tab w:val="left" w:pos="284"/>
+        </w:tabs>
+        <w:rPr>
+          <w:rFonts w:cs="Times New Roman"/>
+          <w:b/>
+          <w:bCs/>
+        </w:rPr>
+      </w:pPr>
+    </w:p>
+    <w:p>
+      <w:pPr>
+        <w:tabs>
+          <w:tab w:val="left" w:pos="284"/>
+        </w:tabs>
+        <w:rPr>
+          <w:rFonts w:cs="Times New Roman"/>
+          <w:b/>
+          <w:bCs/>
+        </w:rPr>
+      </w:pPr>
+    </w:p>
+    <w:p>
+      <w:pPr>
+        <w:tabs>
+          <w:tab w:val="left" w:pos="284"/>
+        </w:tabs>
+        <w:rPr>
+          <w:rFonts w:cs="Times New Roman"/>
+          <w:b/>
+          <w:bCs/>
+        </w:rPr>
+      </w:pPr>
+    </w:p>
+    <w:p>
+      <w:pPr>
+        <w:tabs>
+          <w:tab w:val="left" w:pos="284"/>
+        </w:tabs>
+        <w:rPr>
+          <w:rFonts w:cs="Times New Roman"/>
+          <w:b/>
+          <w:bCs/>
+        </w:rPr>
+      </w:pPr>
+    </w:p>
+    <w:p>
+      <w:pPr>
+        <w:tabs>
+          <w:tab w:val="left" w:pos="284"/>
+        </w:tabs>
+        <w:rPr>
+          <w:rFonts w:cs="Times New Roman"/>
+          <w:b/>
+          <w:bCs/>
+        </w:rPr>
+      </w:pPr>
+    </w:p>
+    <w:p>
+      <w:pPr>
+        <w:tabs>
+          <w:tab w:val="left" w:pos="284"/>
+        </w:tabs>
+        <w:rPr>
+          <w:rFonts w:cs="Times New Roman"/>
+          <w:b/>
+          <w:bCs/>
+        </w:rPr>
+      </w:pPr>
+    </w:p>
+    <w:p>
+      <w:pPr>
+        <w:tabs>
+          <w:tab w:val="left" w:pos="284"/>
+        </w:tabs>
+        <w:rPr>
+          <w:rFonts w:cs="Times New Roman"/>
+          <w:b/>
+          <w:bCs/>
+        </w:rPr>
+      </w:pPr>
+    </w:p>
+    <w:p>
+      <w:pPr>
+        <w:tabs>
+          <w:tab w:val="left" w:pos="284"/>
+        </w:tabs>
+        <w:rPr>
+          <w:rFonts w:cs="Times New Roman"/>
+          <w:b/>
+          <w:bCs/>
+        </w:rPr>
+      </w:pPr>
+    </w:p>
+    <w:p>
+      <w:pPr>
+        <w:tabs>
+          <w:tab w:val="left" w:pos="284"/>
+        </w:tabs>
+        <w:rPr>
+          <w:rFonts w:cs="Times New Roman"/>
+          <w:b/>
+          <w:bCs/>
+        </w:rPr>
+      </w:pPr>
+    </w:p>
+    <w:p>
+      <w:pPr>
+        <w:tabs>
+          <w:tab w:val="left" w:pos="284"/>
+        </w:tabs>
         <w:rPr>
           <w:rFonts w:cs="Times New Roman"/>
           <w:b/>
@@ -3314,6 +3684,9 @@
     <w:p>
       <w:pPr>
         <w:pStyle w:val="Heading1"/>
+        <w:tabs>
+          <w:tab w:val="left" w:pos="284"/>
+        </w:tabs>
         <w:rPr>
           <w:rFonts w:ascii="Times New Roman" w:hAnsi="Times New Roman" w:cs="Times New Roman"/>
           <w:b/>
@@ -3339,10 +3712,19 @@
     </w:p>
     <w:p>
       <w:pPr>
-        <w:rPr>
-          <w:rFonts w:cs="Times New Roman"/>
-        </w:rPr>
-      </w:pPr>
+        <w:tabs>
+          <w:tab w:val="left" w:pos="284"/>
+        </w:tabs>
+        <w:rPr>
+          <w:rFonts w:cs="Times New Roman"/>
+        </w:rPr>
+      </w:pPr>
+      <w:r>
+        <w:rPr>
+          <w:rFonts w:cs="Times New Roman"/>
+        </w:rPr>
+        <w:tab/>
+      </w:r>
       <w:r>
         <w:rPr>
           <w:rFonts w:cs="Times New Roman"/>
@@ -3352,10 +3734,19 @@
     </w:p>
     <w:p>
       <w:pPr>
-        <w:rPr>
-          <w:rFonts w:cs="Times New Roman"/>
-        </w:rPr>
-      </w:pPr>
+        <w:tabs>
+          <w:tab w:val="left" w:pos="284"/>
+        </w:tabs>
+        <w:rPr>
+          <w:rFonts w:cs="Times New Roman"/>
+        </w:rPr>
+      </w:pPr>
+      <w:r>
+        <w:rPr>
+          <w:rFonts w:cs="Times New Roman"/>
+        </w:rPr>
+        <w:tab/>
+      </w:r>
       <w:r>
         <w:rPr>
           <w:rFonts w:cs="Times New Roman"/>
@@ -3365,10 +3756,19 @@
     </w:p>
     <w:p>
       <w:pPr>
-        <w:rPr>
-          <w:rFonts w:cs="Times New Roman"/>
-        </w:rPr>
-      </w:pPr>
+        <w:tabs>
+          <w:tab w:val="left" w:pos="284"/>
+        </w:tabs>
+        <w:rPr>
+          <w:rFonts w:cs="Times New Roman"/>
+        </w:rPr>
+      </w:pPr>
+      <w:r>
+        <w:rPr>
+          <w:rFonts w:cs="Times New Roman"/>
+        </w:rPr>
+        <w:tab/>
+      </w:r>
       <w:r>
         <w:rPr>
           <w:rFonts w:cs="Times New Roman"/>
@@ -3378,10 +3778,19 @@
     </w:p>
     <w:p>
       <w:pPr>
-        <w:rPr>
-          <w:rFonts w:cs="Times New Roman"/>
-        </w:rPr>
-      </w:pPr>
+        <w:tabs>
+          <w:tab w:val="left" w:pos="284"/>
+        </w:tabs>
+        <w:rPr>
+          <w:rFonts w:cs="Times New Roman"/>
+        </w:rPr>
+      </w:pPr>
+      <w:r>
+        <w:rPr>
+          <w:rFonts w:cs="Times New Roman"/>
+        </w:rPr>
+        <w:tab/>
+      </w:r>
       <w:r>
         <w:rPr>
           <w:rFonts w:cs="Times New Roman"/>
@@ -3391,10 +3800,19 @@
     </w:p>
     <w:p>
       <w:pPr>
-        <w:rPr>
-          <w:rFonts w:cs="Times New Roman"/>
-        </w:rPr>
-      </w:pPr>
+        <w:tabs>
+          <w:tab w:val="left" w:pos="284"/>
+        </w:tabs>
+        <w:rPr>
+          <w:rFonts w:cs="Times New Roman"/>
+        </w:rPr>
+      </w:pPr>
+      <w:r>
+        <w:rPr>
+          <w:rFonts w:cs="Times New Roman"/>
+        </w:rPr>
+        <w:tab/>
+      </w:r>
       <w:r>
         <w:rPr>
           <w:rFonts w:cs="Times New Roman"/>
@@ -3405,6 +3823,9 @@
     <w:p>
       <w:pPr>
         <w:pStyle w:val="Heading1"/>
+        <w:tabs>
+          <w:tab w:val="left" w:pos="284"/>
+        </w:tabs>
         <w:rPr>
           <w:rFonts w:ascii="Times New Roman" w:hAnsi="Times New Roman" w:cs="Times New Roman"/>
           <w:b/>
@@ -3422,6 +3843,7 @@
           <w:sz w:val="24"/>
           <w:szCs w:val="24"/>
         </w:rPr>
+        <w:lastRenderedPageBreak/>
         <w:t>2. Mục tiêu</w:t>
       </w:r>
       <w:bookmarkEnd w:id="2"/>
@@ -3439,6 +3861,9 @@
     <w:p>
       <w:pPr>
         <w:pStyle w:val="Heading2"/>
+        <w:tabs>
+          <w:tab w:val="left" w:pos="284"/>
+        </w:tabs>
         <w:rPr>
           <w:rFonts w:ascii="Times New Roman" w:hAnsi="Times New Roman" w:cs="Times New Roman"/>
           <w:b/>
@@ -3472,12 +3897,21 @@
     </w:p>
     <w:p>
       <w:pPr>
-        <w:rPr>
-          <w:rFonts w:cs="Times New Roman"/>
-          <w:b/>
-          <w:bCs/>
-        </w:rPr>
-      </w:pPr>
+        <w:tabs>
+          <w:tab w:val="left" w:pos="284"/>
+        </w:tabs>
+        <w:rPr>
+          <w:rFonts w:cs="Times New Roman"/>
+          <w:b/>
+          <w:bCs/>
+        </w:rPr>
+      </w:pPr>
+      <w:r>
+        <w:rPr>
+          <w:rFonts w:cs="Times New Roman"/>
+        </w:rPr>
+        <w:tab/>
+      </w:r>
       <w:r>
         <w:rPr>
           <w:rFonts w:cs="Times New Roman"/>
@@ -3496,6 +3930,9 @@
     <w:p>
       <w:pPr>
         <w:pStyle w:val="Heading2"/>
+        <w:tabs>
+          <w:tab w:val="left" w:pos="284"/>
+        </w:tabs>
         <w:rPr>
           <w:rFonts w:ascii="Times New Roman" w:hAnsi="Times New Roman" w:cs="Times New Roman"/>
           <w:b/>
@@ -3514,7 +3951,6 @@
           <w:sz w:val="24"/>
           <w:szCs w:val="24"/>
         </w:rPr>
-        <w:lastRenderedPageBreak/>
         <w:t xml:space="preserve">    </w:t>
       </w:r>
       <w:bookmarkStart w:id="4" w:name="_Toc16096"/>
@@ -3537,6 +3973,9 @@
           <w:ilvl w:val="0"/>
           <w:numId w:val="1"/>
         </w:numPr>
+        <w:tabs>
+          <w:tab w:val="left" w:pos="284"/>
+        </w:tabs>
         <w:rPr>
           <w:rFonts w:cs="Times New Roman"/>
         </w:rPr>
@@ -3570,6 +4009,9 @@
           <w:ilvl w:val="0"/>
           <w:numId w:val="1"/>
         </w:numPr>
+        <w:tabs>
+          <w:tab w:val="left" w:pos="284"/>
+        </w:tabs>
         <w:rPr>
           <w:rFonts w:cs="Times New Roman"/>
         </w:rPr>
@@ -3603,6 +4045,9 @@
           <w:ilvl w:val="0"/>
           <w:numId w:val="1"/>
         </w:numPr>
+        <w:tabs>
+          <w:tab w:val="left" w:pos="284"/>
+        </w:tabs>
         <w:rPr>
           <w:rFonts w:cs="Times New Roman"/>
         </w:rPr>
@@ -3636,6 +4081,9 @@
           <w:ilvl w:val="0"/>
           <w:numId w:val="1"/>
         </w:numPr>
+        <w:tabs>
+          <w:tab w:val="left" w:pos="284"/>
+        </w:tabs>
         <w:rPr>
           <w:rFonts w:cs="Times New Roman"/>
         </w:rPr>
@@ -3669,6 +4117,9 @@
           <w:ilvl w:val="0"/>
           <w:numId w:val="1"/>
         </w:numPr>
+        <w:tabs>
+          <w:tab w:val="left" w:pos="284"/>
+        </w:tabs>
         <w:rPr>
           <w:rFonts w:cs="Times New Roman"/>
         </w:rPr>
@@ -3702,6 +4153,9 @@
           <w:ilvl w:val="0"/>
           <w:numId w:val="1"/>
         </w:numPr>
+        <w:tabs>
+          <w:tab w:val="left" w:pos="284"/>
+        </w:tabs>
         <w:rPr>
           <w:rFonts w:cs="Times New Roman"/>
         </w:rPr>
@@ -3735,6 +4189,9 @@
           <w:ilvl w:val="0"/>
           <w:numId w:val="1"/>
         </w:numPr>
+        <w:tabs>
+          <w:tab w:val="left" w:pos="284"/>
+        </w:tabs>
         <w:rPr>
           <w:rFonts w:cs="Times New Roman"/>
         </w:rPr>
@@ -3768,6 +4225,9 @@
           <w:ilvl w:val="0"/>
           <w:numId w:val="1"/>
         </w:numPr>
+        <w:tabs>
+          <w:tab w:val="left" w:pos="284"/>
+        </w:tabs>
         <w:rPr>
           <w:rFonts w:cs="Times New Roman"/>
         </w:rPr>
@@ -3801,6 +4261,9 @@
           <w:ilvl w:val="0"/>
           <w:numId w:val="1"/>
         </w:numPr>
+        <w:tabs>
+          <w:tab w:val="left" w:pos="284"/>
+        </w:tabs>
         <w:rPr>
           <w:rFonts w:cs="Times New Roman"/>
         </w:rPr>
@@ -3835,6 +4298,9 @@
           <w:ilvl w:val="0"/>
           <w:numId w:val="1"/>
         </w:numPr>
+        <w:tabs>
+          <w:tab w:val="left" w:pos="284"/>
+        </w:tabs>
         <w:spacing w:line="276" w:lineRule="auto"/>
       </w:pPr>
       <w:r>
@@ -3856,6 +4322,9 @@
           <w:ilvl w:val="0"/>
           <w:numId w:val="1"/>
         </w:numPr>
+        <w:tabs>
+          <w:tab w:val="left" w:pos="284"/>
+        </w:tabs>
         <w:spacing w:line="276" w:lineRule="auto"/>
       </w:pPr>
       <w:r>
@@ -3863,6 +4332,7 @@
           <w:rStyle w:val="Strong"/>
           <w:rFonts w:eastAsiaTheme="majorEastAsia"/>
         </w:rPr>
+        <w:lastRenderedPageBreak/>
         <w:t>Quản lý cơ sở vật chất và khu vực bảo quản:</w:t>
       </w:r>
       <w:r>
@@ -3877,6 +4347,9 @@
           <w:ilvl w:val="0"/>
           <w:numId w:val="1"/>
         </w:numPr>
+        <w:tabs>
+          <w:tab w:val="left" w:pos="284"/>
+        </w:tabs>
         <w:spacing w:line="276" w:lineRule="auto"/>
       </w:pPr>
       <w:r>
@@ -3898,6 +4371,9 @@
           <w:ilvl w:val="0"/>
           <w:numId w:val="1"/>
         </w:numPr>
+        <w:tabs>
+          <w:tab w:val="left" w:pos="284"/>
+        </w:tabs>
         <w:spacing w:line="276" w:lineRule="auto"/>
       </w:pPr>
       <w:r>
@@ -3909,11 +4385,7 @@
       </w:r>
       <w:r>
         <w:br/>
-        <w:t xml:space="preserve">Lưu trữ thông tin các khoản chi phí phát sinh trong quá trình bảo quản và xử lý thi hài </w:t>
-      </w:r>
-      <w:r>
-        <w:lastRenderedPageBreak/>
-        <w:t>để phục vụ công tác thống kê và quản lý tài chính (mức độ mô phỏng trong phạm vi đồ án).</w:t>
+        <w:t>Lưu trữ thông tin các khoản chi phí phát sinh trong quá trình bảo quản và xử lý thi hài để phục vụ công tác thống kê và quản lý tài chính (mức độ mô phỏng trong phạm vi đồ án).</w:t>
       </w:r>
     </w:p>
     <w:p>
@@ -3923,6 +4395,9 @@
           <w:ilvl w:val="0"/>
           <w:numId w:val="1"/>
         </w:numPr>
+        <w:tabs>
+          <w:tab w:val="left" w:pos="284"/>
+        </w:tabs>
         <w:spacing w:line="276" w:lineRule="auto"/>
       </w:pPr>
       <w:r>
@@ -3944,6 +4419,9 @@
           <w:ilvl w:val="0"/>
           <w:numId w:val="1"/>
         </w:numPr>
+        <w:tabs>
+          <w:tab w:val="left" w:pos="284"/>
+        </w:tabs>
         <w:spacing w:line="276" w:lineRule="auto"/>
       </w:pPr>
       <w:r>
@@ -3965,6 +4443,9 @@
           <w:ilvl w:val="0"/>
           <w:numId w:val="1"/>
         </w:numPr>
+        <w:tabs>
+          <w:tab w:val="left" w:pos="284"/>
+        </w:tabs>
         <w:spacing w:line="276" w:lineRule="auto"/>
       </w:pPr>
       <w:r>
@@ -3982,6 +4463,9 @@
     <w:p>
       <w:pPr>
         <w:pStyle w:val="Heading1"/>
+        <w:tabs>
+          <w:tab w:val="left" w:pos="284"/>
+        </w:tabs>
         <w:rPr>
           <w:rFonts w:ascii="Times New Roman" w:hAnsi="Times New Roman" w:cs="Times New Roman"/>
           <w:color w:val="000000" w:themeColor="text1"/>
@@ -4006,11 +4490,21 @@
     </w:p>
     <w:p>
       <w:pPr>
+        <w:tabs>
+          <w:tab w:val="left" w:pos="284"/>
+        </w:tabs>
         <w:rPr>
           <w:rFonts w:cs="Times New Roman"/>
           <w:lang w:val="vi-VN"/>
         </w:rPr>
       </w:pPr>
+      <w:r>
+        <w:rPr>
+          <w:rFonts w:eastAsia="Times New Roman" w:cs="Times New Roman"/>
+          <w:color w:val="000000"/>
+        </w:rPr>
+        <w:tab/>
+      </w:r>
       <w:r>
         <w:rPr>
           <w:rFonts w:eastAsia="Times New Roman" w:cs="Times New Roman"/>
@@ -4145,6 +4639,9 @@
     </w:p>
     <w:p>
       <w:pPr>
+        <w:tabs>
+          <w:tab w:val="left" w:pos="284"/>
+        </w:tabs>
         <w:rPr>
           <w:rFonts w:cs="Times New Roman"/>
           <w:lang w:val="vi-VN"/>
@@ -4164,6 +4661,9 @@
           <w:ilvl w:val="0"/>
           <w:numId w:val="2"/>
         </w:numPr>
+        <w:tabs>
+          <w:tab w:val="left" w:pos="284"/>
+        </w:tabs>
         <w:spacing w:before="100" w:beforeAutospacing="1" w:after="100" w:afterAutospacing="1" w:line="240" w:lineRule="auto"/>
         <w:rPr>
           <w:rFonts w:eastAsiaTheme="minorEastAsia" w:cs="Times New Roman"/>
@@ -4202,6 +4702,9 @@
           <w:ilvl w:val="0"/>
           <w:numId w:val="2"/>
         </w:numPr>
+        <w:tabs>
+          <w:tab w:val="left" w:pos="284"/>
+        </w:tabs>
         <w:spacing w:before="100" w:beforeAutospacing="1" w:after="100" w:afterAutospacing="1" w:line="240" w:lineRule="auto"/>
         <w:rPr>
           <w:rFonts w:eastAsiaTheme="minorEastAsia" w:cs="Times New Roman"/>
@@ -4240,6 +4743,9 @@
           <w:ilvl w:val="0"/>
           <w:numId w:val="2"/>
         </w:numPr>
+        <w:tabs>
+          <w:tab w:val="left" w:pos="284"/>
+        </w:tabs>
         <w:spacing w:before="100" w:beforeAutospacing="1" w:after="100" w:afterAutospacing="1" w:line="240" w:lineRule="auto"/>
         <w:rPr>
           <w:rFonts w:eastAsiaTheme="minorEastAsia" w:cs="Times New Roman"/>
@@ -4278,6 +4784,9 @@
           <w:ilvl w:val="0"/>
           <w:numId w:val="2"/>
         </w:numPr>
+        <w:tabs>
+          <w:tab w:val="left" w:pos="284"/>
+        </w:tabs>
         <w:spacing w:before="100" w:beforeAutospacing="1" w:after="100" w:afterAutospacing="1" w:line="240" w:lineRule="auto"/>
         <w:rPr>
           <w:rFonts w:eastAsiaTheme="minorEastAsia" w:cs="Times New Roman"/>
@@ -4316,6 +4825,9 @@
           <w:ilvl w:val="0"/>
           <w:numId w:val="2"/>
         </w:numPr>
+        <w:tabs>
+          <w:tab w:val="left" w:pos="284"/>
+        </w:tabs>
         <w:spacing w:before="100" w:beforeAutospacing="1" w:after="100" w:afterAutospacing="1" w:line="240" w:lineRule="auto"/>
         <w:rPr>
           <w:rFonts w:eastAsiaTheme="minorEastAsia" w:cs="Times New Roman"/>
@@ -4330,6 +4842,7 @@
           <w:rFonts w:cs="Times New Roman"/>
           <w:noProof/>
         </w:rPr>
+        <w:lastRenderedPageBreak/>
         <w:drawing>
           <wp:anchor distT="0" distB="0" distL="114300" distR="114300" simplePos="0" relativeHeight="251659264" behindDoc="0" locked="0" layoutInCell="1" allowOverlap="1" wp14:anchorId="2257CC14" wp14:editId="1D3CEB37">
             <wp:simplePos x="0" y="0"/>
@@ -4405,6 +4918,9 @@
     </w:p>
     <w:p>
       <w:pPr>
+        <w:tabs>
+          <w:tab w:val="left" w:pos="284"/>
+        </w:tabs>
         <w:spacing w:before="100" w:beforeAutospacing="1" w:after="100" w:afterAutospacing="1" w:line="240" w:lineRule="auto"/>
         <w:ind w:left="360"/>
         <w:rPr>
@@ -4418,6 +4934,9 @@
     </w:p>
     <w:p>
       <w:pPr>
+        <w:tabs>
+          <w:tab w:val="left" w:pos="284"/>
+        </w:tabs>
         <w:rPr>
           <w:rFonts w:cs="Times New Roman"/>
           <w:lang w:val="vi-VN"/>
@@ -4437,6 +4956,9 @@
           <w:ilvl w:val="0"/>
           <w:numId w:val="3"/>
         </w:numPr>
+        <w:tabs>
+          <w:tab w:val="left" w:pos="284"/>
+        </w:tabs>
         <w:spacing w:before="100" w:beforeAutospacing="1" w:after="100" w:afterAutospacing="1" w:line="240" w:lineRule="auto"/>
         <w:rPr>
           <w:rFonts w:eastAsiaTheme="minorEastAsia" w:cs="Times New Roman"/>
@@ -4456,7 +4978,6 @@
           <w:lang w:val="vi-VN" w:eastAsia="ja-JP"/>
           <w14:ligatures w14:val="none"/>
         </w:rPr>
-        <w:lastRenderedPageBreak/>
         <w:t>MABS</w:t>
       </w:r>
       <w:r>
@@ -4476,6 +4997,9 @@
           <w:ilvl w:val="0"/>
           <w:numId w:val="3"/>
         </w:numPr>
+        <w:tabs>
+          <w:tab w:val="left" w:pos="284"/>
+        </w:tabs>
         <w:spacing w:before="100" w:beforeAutospacing="1" w:after="100" w:afterAutospacing="1" w:line="240" w:lineRule="auto"/>
         <w:rPr>
           <w:rFonts w:eastAsiaTheme="minorEastAsia" w:cs="Times New Roman"/>
@@ -4514,6 +5038,9 @@
           <w:ilvl w:val="0"/>
           <w:numId w:val="3"/>
         </w:numPr>
+        <w:tabs>
+          <w:tab w:val="left" w:pos="284"/>
+        </w:tabs>
         <w:spacing w:before="100" w:beforeAutospacing="1" w:after="100" w:afterAutospacing="1" w:line="240" w:lineRule="auto"/>
         <w:rPr>
           <w:rFonts w:eastAsiaTheme="minorEastAsia" w:cs="Times New Roman"/>
@@ -4552,6 +5079,9 @@
           <w:ilvl w:val="0"/>
           <w:numId w:val="3"/>
         </w:numPr>
+        <w:tabs>
+          <w:tab w:val="left" w:pos="284"/>
+        </w:tabs>
         <w:spacing w:before="100" w:beforeAutospacing="1" w:after="100" w:afterAutospacing="1" w:line="240" w:lineRule="auto"/>
         <w:rPr>
           <w:rFonts w:eastAsiaTheme="minorEastAsia" w:cs="Times New Roman"/>
@@ -4586,6 +5116,9 @@
     </w:p>
     <w:p>
       <w:pPr>
+        <w:tabs>
+          <w:tab w:val="left" w:pos="284"/>
+        </w:tabs>
         <w:spacing w:before="100" w:beforeAutospacing="1" w:after="100" w:afterAutospacing="1" w:line="240" w:lineRule="auto"/>
         <w:rPr>
           <w:rFonts w:eastAsiaTheme="minorEastAsia" w:cs="Times New Roman"/>
@@ -4653,6 +5186,9 @@
     </w:p>
     <w:p>
       <w:pPr>
+        <w:tabs>
+          <w:tab w:val="left" w:pos="284"/>
+        </w:tabs>
         <w:rPr>
           <w:rFonts w:cs="Times New Roman"/>
           <w:lang w:val="vi-VN"/>
@@ -4661,6 +5197,9 @@
     </w:p>
     <w:p>
       <w:pPr>
+        <w:tabs>
+          <w:tab w:val="left" w:pos="284"/>
+        </w:tabs>
         <w:rPr>
           <w:rFonts w:cs="Times New Roman"/>
           <w:lang w:val="vi-VN"/>
@@ -4669,6 +5208,9 @@
     </w:p>
     <w:p>
       <w:pPr>
+        <w:tabs>
+          <w:tab w:val="left" w:pos="284"/>
+        </w:tabs>
         <w:rPr>
           <w:rFonts w:cs="Times New Roman"/>
           <w:lang w:val="vi-VN"/>
@@ -4688,6 +5230,9 @@
           <w:ilvl w:val="0"/>
           <w:numId w:val="4"/>
         </w:numPr>
+        <w:tabs>
+          <w:tab w:val="left" w:pos="284"/>
+        </w:tabs>
         <w:spacing w:before="100" w:beforeAutospacing="1" w:after="100" w:afterAutospacing="1" w:line="240" w:lineRule="auto"/>
         <w:rPr>
           <w:rFonts w:eastAsiaTheme="minorEastAsia" w:cs="Times New Roman"/>
@@ -4726,6 +5271,9 @@
           <w:ilvl w:val="0"/>
           <w:numId w:val="4"/>
         </w:numPr>
+        <w:tabs>
+          <w:tab w:val="left" w:pos="284"/>
+        </w:tabs>
         <w:spacing w:before="100" w:beforeAutospacing="1" w:after="100" w:afterAutospacing="1" w:line="240" w:lineRule="auto"/>
         <w:rPr>
           <w:rFonts w:eastAsiaTheme="minorEastAsia" w:cs="Times New Roman"/>
@@ -4764,6 +5312,9 @@
           <w:ilvl w:val="0"/>
           <w:numId w:val="4"/>
         </w:numPr>
+        <w:tabs>
+          <w:tab w:val="left" w:pos="284"/>
+        </w:tabs>
         <w:spacing w:before="100" w:beforeAutospacing="1" w:after="100" w:afterAutospacing="1" w:line="240" w:lineRule="auto"/>
         <w:rPr>
           <w:rFonts w:eastAsiaTheme="minorEastAsia" w:cs="Times New Roman"/>
@@ -4802,6 +5353,9 @@
           <w:ilvl w:val="0"/>
           <w:numId w:val="4"/>
         </w:numPr>
+        <w:tabs>
+          <w:tab w:val="left" w:pos="284"/>
+        </w:tabs>
         <w:spacing w:before="100" w:beforeAutospacing="1" w:after="100" w:afterAutospacing="1" w:line="240" w:lineRule="auto"/>
         <w:rPr>
           <w:rFonts w:eastAsiaTheme="minorEastAsia" w:cs="Times New Roman"/>
@@ -4840,6 +5394,9 @@
           <w:ilvl w:val="0"/>
           <w:numId w:val="4"/>
         </w:numPr>
+        <w:tabs>
+          <w:tab w:val="left" w:pos="284"/>
+        </w:tabs>
         <w:spacing w:before="100" w:beforeAutospacing="1" w:after="100" w:afterAutospacing="1" w:line="240" w:lineRule="auto"/>
         <w:rPr>
           <w:rFonts w:eastAsiaTheme="minorEastAsia" w:cs="Times New Roman"/>
@@ -4874,6 +5431,9 @@
     </w:p>
     <w:p>
       <w:pPr>
+        <w:tabs>
+          <w:tab w:val="left" w:pos="284"/>
+        </w:tabs>
         <w:spacing w:before="100" w:beforeAutospacing="1" w:after="100" w:afterAutospacing="1" w:line="240" w:lineRule="auto"/>
         <w:ind w:left="360"/>
         <w:rPr>
@@ -4889,6 +5449,7 @@
           <w:rFonts w:cs="Times New Roman"/>
           <w:noProof/>
         </w:rPr>
+        <w:lastRenderedPageBreak/>
         <w:drawing>
           <wp:anchor distT="0" distB="0" distL="114300" distR="114300" simplePos="0" relativeHeight="251660288" behindDoc="0" locked="0" layoutInCell="1" allowOverlap="1" wp14:anchorId="1DC2C25D" wp14:editId="53A73A08">
             <wp:simplePos x="0" y="0"/>
@@ -4942,6 +5503,9 @@
     </w:p>
     <w:p>
       <w:pPr>
+        <w:tabs>
+          <w:tab w:val="left" w:pos="284"/>
+        </w:tabs>
         <w:rPr>
           <w:rFonts w:cs="Times New Roman"/>
           <w:lang w:val="vi-VN"/>
@@ -4961,6 +5525,9 @@
           <w:ilvl w:val="0"/>
           <w:numId w:val="5"/>
         </w:numPr>
+        <w:tabs>
+          <w:tab w:val="left" w:pos="284"/>
+        </w:tabs>
         <w:spacing w:before="100" w:beforeAutospacing="1" w:after="100" w:afterAutospacing="1" w:line="240" w:lineRule="auto"/>
         <w:rPr>
           <w:rFonts w:eastAsiaTheme="minorEastAsia" w:cs="Times New Roman"/>
@@ -4999,6 +5566,9 @@
           <w:ilvl w:val="0"/>
           <w:numId w:val="5"/>
         </w:numPr>
+        <w:tabs>
+          <w:tab w:val="left" w:pos="284"/>
+        </w:tabs>
         <w:spacing w:before="100" w:beforeAutospacing="1" w:after="100" w:afterAutospacing="1" w:line="240" w:lineRule="auto"/>
         <w:rPr>
           <w:rFonts w:eastAsiaTheme="minorEastAsia" w:cs="Times New Roman"/>
@@ -5037,6 +5607,9 @@
           <w:ilvl w:val="0"/>
           <w:numId w:val="5"/>
         </w:numPr>
+        <w:tabs>
+          <w:tab w:val="left" w:pos="284"/>
+        </w:tabs>
         <w:spacing w:before="100" w:beforeAutospacing="1" w:after="100" w:afterAutospacing="1" w:line="240" w:lineRule="auto"/>
         <w:rPr>
           <w:rFonts w:eastAsiaTheme="minorEastAsia" w:cs="Times New Roman"/>
@@ -5075,6 +5648,9 @@
           <w:ilvl w:val="0"/>
           <w:numId w:val="5"/>
         </w:numPr>
+        <w:tabs>
+          <w:tab w:val="left" w:pos="284"/>
+        </w:tabs>
         <w:spacing w:before="100" w:beforeAutospacing="1" w:after="100" w:afterAutospacing="1" w:line="240" w:lineRule="auto"/>
         <w:rPr>
           <w:rFonts w:eastAsiaTheme="minorEastAsia" w:cs="Times New Roman"/>
@@ -5109,6 +5685,9 @@
     </w:p>
     <w:p>
       <w:pPr>
+        <w:tabs>
+          <w:tab w:val="left" w:pos="284"/>
+        </w:tabs>
         <w:spacing w:before="100" w:beforeAutospacing="1" w:after="100" w:afterAutospacing="1" w:line="240" w:lineRule="auto"/>
         <w:rPr>
           <w:rFonts w:eastAsiaTheme="minorEastAsia" w:cs="Times New Roman"/>
@@ -5123,7 +5702,6 @@
           <w:rFonts w:cs="Times New Roman"/>
           <w:noProof/>
         </w:rPr>
-        <w:lastRenderedPageBreak/>
         <w:drawing>
           <wp:anchor distT="0" distB="0" distL="114300" distR="114300" simplePos="0" relativeHeight="251661312" behindDoc="0" locked="0" layoutInCell="1" allowOverlap="1" wp14:anchorId="516A335A" wp14:editId="7240D37E">
             <wp:simplePos x="0" y="0"/>
@@ -5177,6 +5755,9 @@
     </w:p>
     <w:p>
       <w:pPr>
+        <w:tabs>
+          <w:tab w:val="left" w:pos="284"/>
+        </w:tabs>
         <w:spacing w:before="100" w:beforeAutospacing="1" w:after="100" w:afterAutospacing="1" w:line="240" w:lineRule="auto"/>
         <w:rPr>
           <w:rFonts w:eastAsiaTheme="minorEastAsia" w:cs="Times New Roman"/>
@@ -5189,6 +5770,9 @@
     </w:p>
     <w:p>
       <w:pPr>
+        <w:tabs>
+          <w:tab w:val="left" w:pos="284"/>
+        </w:tabs>
         <w:spacing w:before="100" w:beforeAutospacing="1" w:after="100" w:afterAutospacing="1" w:line="240" w:lineRule="auto"/>
         <w:rPr>
           <w:rFonts w:eastAsiaTheme="minorEastAsia" w:cs="Times New Roman"/>
@@ -5215,6 +5799,9 @@
           <w:ilvl w:val="0"/>
           <w:numId w:val="6"/>
         </w:numPr>
+        <w:tabs>
+          <w:tab w:val="left" w:pos="284"/>
+        </w:tabs>
         <w:spacing w:before="100" w:beforeAutospacing="1" w:after="100" w:afterAutospacing="1" w:line="240" w:lineRule="auto"/>
         <w:rPr>
           <w:rFonts w:eastAsiaTheme="minorEastAsia" w:cs="Times New Roman"/>
@@ -5253,6 +5840,9 @@
           <w:ilvl w:val="0"/>
           <w:numId w:val="6"/>
         </w:numPr>
+        <w:tabs>
+          <w:tab w:val="left" w:pos="284"/>
+        </w:tabs>
         <w:spacing w:before="100" w:beforeAutospacing="1" w:after="100" w:afterAutospacing="1" w:line="240" w:lineRule="auto"/>
         <w:rPr>
           <w:rFonts w:eastAsiaTheme="minorEastAsia" w:cs="Times New Roman"/>
@@ -5291,6 +5881,9 @@
           <w:ilvl w:val="0"/>
           <w:numId w:val="6"/>
         </w:numPr>
+        <w:tabs>
+          <w:tab w:val="left" w:pos="284"/>
+        </w:tabs>
         <w:spacing w:before="100" w:beforeAutospacing="1" w:after="100" w:afterAutospacing="1" w:line="240" w:lineRule="auto"/>
         <w:rPr>
           <w:rFonts w:eastAsiaTheme="minorEastAsia" w:cs="Times New Roman"/>
@@ -5325,6 +5918,9 @@
     </w:p>
     <w:p>
       <w:pPr>
+        <w:tabs>
+          <w:tab w:val="left" w:pos="284"/>
+        </w:tabs>
         <w:spacing w:before="100" w:beforeAutospacing="1" w:after="100" w:afterAutospacing="1" w:line="240" w:lineRule="auto"/>
         <w:ind w:left="360"/>
         <w:rPr>
@@ -5340,6 +5936,7 @@
           <w:rFonts w:cs="Times New Roman"/>
           <w:noProof/>
         </w:rPr>
+        <w:lastRenderedPageBreak/>
         <w:drawing>
           <wp:anchor distT="0" distB="0" distL="114300" distR="114300" simplePos="0" relativeHeight="251663360" behindDoc="0" locked="0" layoutInCell="1" allowOverlap="1" wp14:anchorId="3BFE73C6" wp14:editId="2BAC3518">
             <wp:simplePos x="0" y="0"/>
@@ -5393,6 +5990,9 @@
     </w:p>
     <w:p>
       <w:pPr>
+        <w:tabs>
+          <w:tab w:val="left" w:pos="284"/>
+        </w:tabs>
         <w:rPr>
           <w:rFonts w:eastAsiaTheme="minorEastAsia" w:cs="Times New Roman"/>
           <w:color w:val="000000"/>
@@ -5414,6 +6014,9 @@
     </w:p>
     <w:p>
       <w:pPr>
+        <w:tabs>
+          <w:tab w:val="left" w:pos="284"/>
+        </w:tabs>
         <w:spacing w:before="100" w:beforeAutospacing="1" w:after="100" w:afterAutospacing="1" w:line="240" w:lineRule="auto"/>
         <w:rPr>
           <w:rFonts w:eastAsiaTheme="minorEastAsia" w:cs="Times New Roman"/>
@@ -5441,6 +6044,9 @@
           <w:ilvl w:val="0"/>
           <w:numId w:val="7"/>
         </w:numPr>
+        <w:tabs>
+          <w:tab w:val="left" w:pos="284"/>
+        </w:tabs>
         <w:spacing w:before="100" w:beforeAutospacing="1" w:after="100" w:afterAutospacing="1" w:line="240" w:lineRule="auto"/>
         <w:rPr>
           <w:rFonts w:eastAsiaTheme="minorEastAsia" w:cs="Times New Roman"/>
@@ -5479,6 +6085,9 @@
           <w:ilvl w:val="0"/>
           <w:numId w:val="7"/>
         </w:numPr>
+        <w:tabs>
+          <w:tab w:val="left" w:pos="284"/>
+        </w:tabs>
         <w:spacing w:before="100" w:beforeAutospacing="1" w:after="100" w:afterAutospacing="1" w:line="240" w:lineRule="auto"/>
         <w:rPr>
           <w:rFonts w:eastAsiaTheme="minorEastAsia" w:cs="Times New Roman"/>
@@ -5517,6 +6126,9 @@
           <w:ilvl w:val="0"/>
           <w:numId w:val="7"/>
         </w:numPr>
+        <w:tabs>
+          <w:tab w:val="left" w:pos="284"/>
+        </w:tabs>
         <w:spacing w:before="100" w:beforeAutospacing="1" w:after="100" w:afterAutospacing="1" w:line="240" w:lineRule="auto"/>
         <w:rPr>
           <w:rFonts w:eastAsiaTheme="minorEastAsia" w:cs="Times New Roman"/>
@@ -5555,6 +6167,9 @@
           <w:ilvl w:val="0"/>
           <w:numId w:val="7"/>
         </w:numPr>
+        <w:tabs>
+          <w:tab w:val="left" w:pos="284"/>
+        </w:tabs>
         <w:spacing w:before="100" w:beforeAutospacing="1" w:after="100" w:afterAutospacing="1" w:line="240" w:lineRule="auto"/>
         <w:rPr>
           <w:rFonts w:eastAsiaTheme="minorEastAsia" w:cs="Times New Roman"/>
@@ -5589,6 +6204,9 @@
     </w:p>
     <w:p>
       <w:pPr>
+        <w:tabs>
+          <w:tab w:val="left" w:pos="284"/>
+        </w:tabs>
         <w:spacing w:before="100" w:beforeAutospacing="1" w:after="100" w:afterAutospacing="1" w:line="240" w:lineRule="auto"/>
         <w:ind w:left="360"/>
         <w:rPr>
@@ -5658,6 +6276,9 @@
     <w:p>
       <w:pPr>
         <w:pStyle w:val="Heading1"/>
+        <w:tabs>
+          <w:tab w:val="left" w:pos="284"/>
+        </w:tabs>
         <w:rPr>
           <w:rFonts w:cs="Times New Roman"/>
           <w:color w:val="000000" w:themeColor="text1"/>
@@ -5679,6 +6300,9 @@
     </w:p>
     <w:p>
       <w:pPr>
+        <w:tabs>
+          <w:tab w:val="left" w:pos="284"/>
+        </w:tabs>
         <w:rPr>
           <w:rFonts w:cs="Times New Roman"/>
         </w:rPr>
@@ -5700,6 +6324,9 @@
     </w:p>
     <w:p>
       <w:pPr>
+        <w:tabs>
+          <w:tab w:val="left" w:pos="284"/>
+        </w:tabs>
         <w:rPr>
           <w:rFonts w:cs="Times New Roman"/>
         </w:rPr>
@@ -5708,6 +6335,9 @@
     <w:p>
       <w:pPr>
         <w:pStyle w:val="Heading2"/>
+        <w:tabs>
+          <w:tab w:val="left" w:pos="284"/>
+        </w:tabs>
         <w:rPr>
           <w:rFonts w:ascii="Times New Roman" w:hAnsi="Times New Roman" w:cs="Times New Roman"/>
           <w:b/>
@@ -5744,6 +6374,9 @@
     </w:p>
     <w:p>
       <w:pPr>
+        <w:tabs>
+          <w:tab w:val="left" w:pos="284"/>
+        </w:tabs>
         <w:rPr>
           <w:rFonts w:cs="Times New Roman"/>
         </w:rPr>
@@ -5771,6 +6404,9 @@
     </w:p>
     <w:p>
       <w:pPr>
+        <w:tabs>
+          <w:tab w:val="left" w:pos="284"/>
+        </w:tabs>
         <w:rPr>
           <w:rFonts w:cs="Times New Roman"/>
         </w:rPr>
@@ -5798,6 +6434,9 @@
     </w:p>
     <w:p>
       <w:pPr>
+        <w:tabs>
+          <w:tab w:val="left" w:pos="284"/>
+        </w:tabs>
         <w:rPr>
           <w:rFonts w:cs="Times New Roman"/>
         </w:rPr>
@@ -5839,6 +6478,9 @@
     </w:p>
     <w:p>
       <w:pPr>
+        <w:tabs>
+          <w:tab w:val="left" w:pos="284"/>
+        </w:tabs>
         <w:rPr>
           <w:rFonts w:cs="Times New Roman"/>
         </w:rPr>
@@ -5866,6 +6508,9 @@
     </w:p>
     <w:p>
       <w:pPr>
+        <w:tabs>
+          <w:tab w:val="left" w:pos="284"/>
+        </w:tabs>
         <w:rPr>
           <w:rFonts w:cs="Times New Roman"/>
         </w:rPr>
@@ -5879,6 +6524,9 @@
     </w:p>
     <w:p>
       <w:pPr>
+        <w:tabs>
+          <w:tab w:val="left" w:pos="284"/>
+        </w:tabs>
         <w:rPr>
           <w:rFonts w:cs="Times New Roman"/>
         </w:rPr>
@@ -5906,6 +6554,9 @@
     </w:p>
     <w:p>
       <w:pPr>
+        <w:tabs>
+          <w:tab w:val="left" w:pos="284"/>
+        </w:tabs>
         <w:rPr>
           <w:rFonts w:cs="Times New Roman"/>
         </w:rPr>
@@ -5919,6 +6570,9 @@
     </w:p>
     <w:p>
       <w:pPr>
+        <w:tabs>
+          <w:tab w:val="left" w:pos="284"/>
+        </w:tabs>
         <w:rPr>
           <w:rFonts w:cs="Times New Roman"/>
         </w:rPr>
@@ -5946,6 +6600,9 @@
     </w:p>
     <w:p>
       <w:pPr>
+        <w:tabs>
+          <w:tab w:val="left" w:pos="284"/>
+        </w:tabs>
         <w:rPr>
           <w:rFonts w:cs="Times New Roman"/>
         </w:rPr>
@@ -5988,6 +6645,9 @@
     </w:p>
     <w:p>
       <w:pPr>
+        <w:tabs>
+          <w:tab w:val="left" w:pos="284"/>
+        </w:tabs>
         <w:rPr>
           <w:rFonts w:cs="Times New Roman"/>
         </w:rPr>
@@ -6050,6 +6710,9 @@
     </w:p>
     <w:p>
       <w:pPr>
+        <w:tabs>
+          <w:tab w:val="left" w:pos="284"/>
+        </w:tabs>
         <w:rPr>
           <w:rFonts w:cs="Times New Roman"/>
         </w:rPr>
@@ -6058,6 +6721,9 @@
     <w:p>
       <w:pPr>
         <w:pStyle w:val="Heading2"/>
+        <w:tabs>
+          <w:tab w:val="left" w:pos="284"/>
+        </w:tabs>
         <w:rPr>
           <w:rFonts w:ascii="Times New Roman" w:hAnsi="Times New Roman" w:cs="Times New Roman"/>
           <w:b/>
@@ -6103,6 +6769,9 @@
     </w:p>
     <w:p>
       <w:pPr>
+        <w:tabs>
+          <w:tab w:val="left" w:pos="284"/>
+        </w:tabs>
         <w:rPr>
           <w:rFonts w:cs="Times New Roman"/>
         </w:rPr>
@@ -6130,6 +6799,9 @@
     </w:p>
     <w:p>
       <w:pPr>
+        <w:tabs>
+          <w:tab w:val="left" w:pos="284"/>
+        </w:tabs>
         <w:rPr>
           <w:rFonts w:cs="Times New Roman"/>
         </w:rPr>
@@ -6157,6 +6829,9 @@
     </w:p>
     <w:p>
       <w:pPr>
+        <w:tabs>
+          <w:tab w:val="left" w:pos="284"/>
+        </w:tabs>
         <w:rPr>
           <w:rFonts w:cs="Times New Roman"/>
         </w:rPr>
@@ -6198,6 +6873,9 @@
     </w:p>
     <w:p>
       <w:pPr>
+        <w:tabs>
+          <w:tab w:val="left" w:pos="284"/>
+        </w:tabs>
         <w:rPr>
           <w:rFonts w:cs="Times New Roman"/>
         </w:rPr>
@@ -6225,6 +6903,9 @@
     </w:p>
     <w:p>
       <w:pPr>
+        <w:tabs>
+          <w:tab w:val="left" w:pos="284"/>
+        </w:tabs>
         <w:rPr>
           <w:rFonts w:cs="Times New Roman"/>
         </w:rPr>
@@ -6238,6 +6919,9 @@
     </w:p>
     <w:p>
       <w:pPr>
+        <w:tabs>
+          <w:tab w:val="left" w:pos="284"/>
+        </w:tabs>
         <w:rPr>
           <w:rFonts w:cs="Times New Roman"/>
         </w:rPr>
@@ -6265,6 +6949,9 @@
     </w:p>
     <w:p>
       <w:pPr>
+        <w:tabs>
+          <w:tab w:val="left" w:pos="284"/>
+        </w:tabs>
         <w:rPr>
           <w:rFonts w:cs="Times New Roman"/>
         </w:rPr>
@@ -6292,6 +6979,9 @@
     </w:p>
     <w:p>
       <w:pPr>
+        <w:tabs>
+          <w:tab w:val="left" w:pos="284"/>
+        </w:tabs>
         <w:rPr>
           <w:rFonts w:cs="Times New Roman"/>
         </w:rPr>
@@ -6354,6 +7044,9 @@
     </w:p>
     <w:p>
       <w:pPr>
+        <w:tabs>
+          <w:tab w:val="left" w:pos="284"/>
+        </w:tabs>
         <w:rPr>
           <w:rFonts w:cs="Times New Roman"/>
         </w:rPr>
@@ -6362,6 +7055,9 @@
     <w:p>
       <w:pPr>
         <w:pStyle w:val="Heading2"/>
+        <w:tabs>
+          <w:tab w:val="left" w:pos="284"/>
+        </w:tabs>
         <w:rPr>
           <w:rFonts w:ascii="Times New Roman" w:hAnsi="Times New Roman" w:cs="Times New Roman"/>
           <w:color w:val="000000" w:themeColor="text1"/>
@@ -6413,6 +7109,9 @@
     </w:p>
     <w:p>
       <w:pPr>
+        <w:tabs>
+          <w:tab w:val="left" w:pos="284"/>
+        </w:tabs>
         <w:rPr>
           <w:rFonts w:cs="Times New Roman"/>
         </w:rPr>
@@ -6440,6 +7139,9 @@
     </w:p>
     <w:p>
       <w:pPr>
+        <w:tabs>
+          <w:tab w:val="left" w:pos="284"/>
+        </w:tabs>
         <w:rPr>
           <w:rFonts w:cs="Times New Roman"/>
         </w:rPr>
@@ -6467,6 +7169,9 @@
     </w:p>
     <w:p>
       <w:pPr>
+        <w:tabs>
+          <w:tab w:val="left" w:pos="284"/>
+        </w:tabs>
         <w:rPr>
           <w:rFonts w:cs="Times New Roman"/>
         </w:rPr>
@@ -6508,6 +7213,9 @@
     </w:p>
     <w:p>
       <w:pPr>
+        <w:tabs>
+          <w:tab w:val="left" w:pos="284"/>
+        </w:tabs>
         <w:rPr>
           <w:rFonts w:cs="Times New Roman"/>
         </w:rPr>
@@ -6535,6 +7243,9 @@
     </w:p>
     <w:p>
       <w:pPr>
+        <w:tabs>
+          <w:tab w:val="left" w:pos="284"/>
+        </w:tabs>
         <w:rPr>
           <w:rFonts w:cs="Times New Roman"/>
         </w:rPr>
@@ -6563,6 +7274,9 @@
     </w:p>
     <w:p>
       <w:pPr>
+        <w:tabs>
+          <w:tab w:val="left" w:pos="284"/>
+        </w:tabs>
         <w:rPr>
           <w:rFonts w:cs="Times New Roman"/>
         </w:rPr>
@@ -6590,6 +7304,9 @@
     </w:p>
     <w:p>
       <w:pPr>
+        <w:tabs>
+          <w:tab w:val="left" w:pos="284"/>
+        </w:tabs>
         <w:rPr>
           <w:rFonts w:cs="Times New Roman"/>
         </w:rPr>
@@ -6603,6 +7320,9 @@
     </w:p>
     <w:p>
       <w:pPr>
+        <w:tabs>
+          <w:tab w:val="left" w:pos="284"/>
+        </w:tabs>
         <w:rPr>
           <w:rFonts w:cs="Times New Roman"/>
         </w:rPr>
@@ -6630,6 +7350,9 @@
     </w:p>
     <w:p>
       <w:pPr>
+        <w:tabs>
+          <w:tab w:val="left" w:pos="284"/>
+        </w:tabs>
         <w:rPr>
           <w:rFonts w:cs="Times New Roman"/>
         </w:rPr>
@@ -6693,6 +7416,9 @@
     </w:p>
     <w:p>
       <w:pPr>
+        <w:tabs>
+          <w:tab w:val="left" w:pos="284"/>
+        </w:tabs>
         <w:rPr>
           <w:rFonts w:cs="Times New Roman"/>
         </w:rPr>
@@ -6755,6 +7481,9 @@
     </w:p>
     <w:p>
       <w:pPr>
+        <w:tabs>
+          <w:tab w:val="left" w:pos="284"/>
+        </w:tabs>
         <w:rPr>
           <w:rFonts w:cs="Times New Roman"/>
           <w:i/>
@@ -6765,6 +7494,9 @@
     <w:p>
       <w:pPr>
         <w:pStyle w:val="Heading2"/>
+        <w:tabs>
+          <w:tab w:val="left" w:pos="284"/>
+        </w:tabs>
         <w:rPr>
           <w:rFonts w:ascii="Times New Roman" w:hAnsi="Times New Roman" w:cs="Times New Roman"/>
           <w:color w:val="000000" w:themeColor="text1"/>
@@ -6808,6 +7540,9 @@
     </w:p>
     <w:p>
       <w:pPr>
+        <w:tabs>
+          <w:tab w:val="left" w:pos="284"/>
+        </w:tabs>
         <w:rPr>
           <w:rFonts w:cs="Times New Roman"/>
         </w:rPr>
@@ -6835,6 +7570,9 @@
     </w:p>
     <w:p>
       <w:pPr>
+        <w:tabs>
+          <w:tab w:val="left" w:pos="284"/>
+        </w:tabs>
         <w:rPr>
           <w:rFonts w:cs="Times New Roman"/>
         </w:rPr>
@@ -6862,6 +7600,9 @@
     </w:p>
     <w:p>
       <w:pPr>
+        <w:tabs>
+          <w:tab w:val="left" w:pos="284"/>
+        </w:tabs>
         <w:rPr>
           <w:rFonts w:cs="Times New Roman"/>
         </w:rPr>
@@ -6903,6 +7644,9 @@
     </w:p>
     <w:p>
       <w:pPr>
+        <w:tabs>
+          <w:tab w:val="left" w:pos="284"/>
+        </w:tabs>
         <w:rPr>
           <w:rFonts w:cs="Times New Roman"/>
         </w:rPr>
@@ -6930,6 +7674,9 @@
     </w:p>
     <w:p>
       <w:pPr>
+        <w:tabs>
+          <w:tab w:val="left" w:pos="284"/>
+        </w:tabs>
         <w:rPr>
           <w:rFonts w:cs="Times New Roman"/>
         </w:rPr>
@@ -6951,6 +7698,9 @@
     </w:p>
     <w:p>
       <w:pPr>
+        <w:tabs>
+          <w:tab w:val="left" w:pos="284"/>
+        </w:tabs>
         <w:rPr>
           <w:rFonts w:cs="Times New Roman"/>
         </w:rPr>
@@ -6978,6 +7728,9 @@
     </w:p>
     <w:p>
       <w:pPr>
+        <w:tabs>
+          <w:tab w:val="left" w:pos="284"/>
+        </w:tabs>
         <w:rPr>
           <w:rFonts w:cs="Times New Roman"/>
         </w:rPr>
@@ -7005,6 +7758,9 @@
     </w:p>
     <w:p>
       <w:pPr>
+        <w:tabs>
+          <w:tab w:val="left" w:pos="284"/>
+        </w:tabs>
         <w:rPr>
           <w:rFonts w:cs="Times New Roman"/>
         </w:rPr>
@@ -7032,6 +7788,9 @@
     </w:p>
     <w:p>
       <w:pPr>
+        <w:tabs>
+          <w:tab w:val="left" w:pos="284"/>
+        </w:tabs>
         <w:rPr>
           <w:rFonts w:cs="Times New Roman"/>
         </w:rPr>
@@ -7059,13 +7818,19 @@
     </w:p>
     <w:p>
       <w:pPr>
-        <w:rPr>
-          <w:rFonts w:cs="Times New Roman"/>
-        </w:rPr>
-      </w:pPr>
-    </w:p>
-    <w:p>
-      <w:pPr>
+        <w:tabs>
+          <w:tab w:val="left" w:pos="284"/>
+        </w:tabs>
+        <w:rPr>
+          <w:rFonts w:cs="Times New Roman"/>
+        </w:rPr>
+      </w:pPr>
+    </w:p>
+    <w:p>
+      <w:pPr>
+        <w:tabs>
+          <w:tab w:val="left" w:pos="284"/>
+        </w:tabs>
         <w:rPr>
           <w:rFonts w:cs="Times New Roman"/>
         </w:rPr>
@@ -7130,6 +7895,9 @@
     <w:p>
       <w:pPr>
         <w:pStyle w:val="Heading2"/>
+        <w:tabs>
+          <w:tab w:val="left" w:pos="284"/>
+        </w:tabs>
         <w:rPr>
           <w:rFonts w:ascii="Times New Roman" w:hAnsi="Times New Roman" w:cs="Times New Roman"/>
           <w:i/>
@@ -7168,6 +7936,9 @@
     </w:p>
     <w:p>
       <w:pPr>
+        <w:tabs>
+          <w:tab w:val="left" w:pos="284"/>
+        </w:tabs>
         <w:rPr>
           <w:rFonts w:cs="Times New Roman"/>
         </w:rPr>
@@ -7195,13 +7966,19 @@
     </w:p>
     <w:p>
       <w:pPr>
-        <w:rPr>
-          <w:rFonts w:cs="Times New Roman"/>
-        </w:rPr>
-      </w:pPr>
-    </w:p>
-    <w:p>
-      <w:pPr>
+        <w:tabs>
+          <w:tab w:val="left" w:pos="284"/>
+        </w:tabs>
+        <w:rPr>
+          <w:rFonts w:cs="Times New Roman"/>
+        </w:rPr>
+      </w:pPr>
+    </w:p>
+    <w:p>
+      <w:pPr>
+        <w:tabs>
+          <w:tab w:val="left" w:pos="284"/>
+        </w:tabs>
         <w:rPr>
           <w:rFonts w:cs="Times New Roman"/>
         </w:rPr>
@@ -7229,6 +8006,9 @@
     </w:p>
     <w:p>
       <w:pPr>
+        <w:tabs>
+          <w:tab w:val="left" w:pos="284"/>
+        </w:tabs>
         <w:rPr>
           <w:rFonts w:cs="Times New Roman"/>
         </w:rPr>
@@ -7242,13 +8022,19 @@
     </w:p>
     <w:p>
       <w:pPr>
-        <w:rPr>
-          <w:rFonts w:cs="Times New Roman"/>
-        </w:rPr>
-      </w:pPr>
-    </w:p>
-    <w:p>
-      <w:pPr>
+        <w:tabs>
+          <w:tab w:val="left" w:pos="284"/>
+        </w:tabs>
+        <w:rPr>
+          <w:rFonts w:cs="Times New Roman"/>
+        </w:rPr>
+      </w:pPr>
+    </w:p>
+    <w:p>
+      <w:pPr>
+        <w:tabs>
+          <w:tab w:val="left" w:pos="284"/>
+        </w:tabs>
         <w:rPr>
           <w:rFonts w:cs="Times New Roman"/>
         </w:rPr>
@@ -7270,6 +8056,9 @@
     </w:p>
     <w:p>
       <w:pPr>
+        <w:tabs>
+          <w:tab w:val="left" w:pos="284"/>
+        </w:tabs>
         <w:rPr>
           <w:rFonts w:cs="Times New Roman"/>
         </w:rPr>
@@ -7283,13 +8072,19 @@
     </w:p>
     <w:p>
       <w:pPr>
-        <w:rPr>
-          <w:rFonts w:cs="Times New Roman"/>
-        </w:rPr>
-      </w:pPr>
-    </w:p>
-    <w:p>
-      <w:pPr>
+        <w:tabs>
+          <w:tab w:val="left" w:pos="284"/>
+        </w:tabs>
+        <w:rPr>
+          <w:rFonts w:cs="Times New Roman"/>
+        </w:rPr>
+      </w:pPr>
+    </w:p>
+    <w:p>
+      <w:pPr>
+        <w:tabs>
+          <w:tab w:val="left" w:pos="284"/>
+        </w:tabs>
         <w:rPr>
           <w:rFonts w:cs="Times New Roman"/>
         </w:rPr>
@@ -7317,6 +8112,9 @@
     </w:p>
     <w:p>
       <w:pPr>
+        <w:tabs>
+          <w:tab w:val="left" w:pos="284"/>
+        </w:tabs>
         <w:rPr>
           <w:rFonts w:cs="Times New Roman"/>
         </w:rPr>
@@ -7344,6 +8142,9 @@
     </w:p>
     <w:p>
       <w:pPr>
+        <w:tabs>
+          <w:tab w:val="left" w:pos="284"/>
+        </w:tabs>
         <w:rPr>
           <w:rFonts w:cs="Times New Roman"/>
         </w:rPr>
@@ -7407,6 +8208,9 @@
     <w:p>
       <w:pPr>
         <w:pStyle w:val="Heading2"/>
+        <w:tabs>
+          <w:tab w:val="left" w:pos="284"/>
+        </w:tabs>
         <w:rPr>
           <w:rFonts w:ascii="Times New Roman" w:hAnsi="Times New Roman" w:cs="Times New Roman"/>
           <w:color w:val="000000" w:themeColor="text1"/>
@@ -7459,6 +8263,9 @@
     </w:p>
     <w:p>
       <w:pPr>
+        <w:tabs>
+          <w:tab w:val="left" w:pos="284"/>
+        </w:tabs>
         <w:rPr>
           <w:rFonts w:cs="Times New Roman"/>
         </w:rPr>
@@ -7514,13 +8321,19 @@
     </w:p>
     <w:p>
       <w:pPr>
-        <w:rPr>
-          <w:rFonts w:cs="Times New Roman"/>
-        </w:rPr>
-      </w:pPr>
-    </w:p>
-    <w:p>
-      <w:pPr>
+        <w:tabs>
+          <w:tab w:val="left" w:pos="284"/>
+        </w:tabs>
+        <w:rPr>
+          <w:rFonts w:cs="Times New Roman"/>
+        </w:rPr>
+      </w:pPr>
+    </w:p>
+    <w:p>
+      <w:pPr>
+        <w:tabs>
+          <w:tab w:val="left" w:pos="284"/>
+        </w:tabs>
         <w:rPr>
           <w:rFonts w:cs="Times New Roman"/>
         </w:rPr>
@@ -7548,6 +8361,9 @@
     </w:p>
     <w:p>
       <w:pPr>
+        <w:tabs>
+          <w:tab w:val="left" w:pos="284"/>
+        </w:tabs>
         <w:rPr>
           <w:rFonts w:cs="Times New Roman"/>
         </w:rPr>
@@ -7589,13 +8405,19 @@
     </w:p>
     <w:p>
       <w:pPr>
-        <w:rPr>
-          <w:rFonts w:cs="Times New Roman"/>
-        </w:rPr>
-      </w:pPr>
-    </w:p>
-    <w:p>
-      <w:pPr>
+        <w:tabs>
+          <w:tab w:val="left" w:pos="284"/>
+        </w:tabs>
+        <w:rPr>
+          <w:rFonts w:cs="Times New Roman"/>
+        </w:rPr>
+      </w:pPr>
+    </w:p>
+    <w:p>
+      <w:pPr>
+        <w:tabs>
+          <w:tab w:val="left" w:pos="284"/>
+        </w:tabs>
         <w:rPr>
           <w:rFonts w:cs="Times New Roman"/>
         </w:rPr>
@@ -7623,6 +8445,9 @@
     </w:p>
     <w:p>
       <w:pPr>
+        <w:tabs>
+          <w:tab w:val="left" w:pos="284"/>
+        </w:tabs>
         <w:rPr>
           <w:rFonts w:cs="Times New Roman"/>
         </w:rPr>
@@ -7650,13 +8475,19 @@
     </w:p>
     <w:p>
       <w:pPr>
-        <w:rPr>
-          <w:rFonts w:cs="Times New Roman"/>
-        </w:rPr>
-      </w:pPr>
-    </w:p>
-    <w:p>
-      <w:pPr>
+        <w:tabs>
+          <w:tab w:val="left" w:pos="284"/>
+        </w:tabs>
+        <w:rPr>
+          <w:rFonts w:cs="Times New Roman"/>
+        </w:rPr>
+      </w:pPr>
+    </w:p>
+    <w:p>
+      <w:pPr>
+        <w:tabs>
+          <w:tab w:val="left" w:pos="284"/>
+        </w:tabs>
         <w:rPr>
           <w:rFonts w:cs="Times New Roman"/>
         </w:rPr>
@@ -7684,6 +8515,9 @@
     </w:p>
     <w:p>
       <w:pPr>
+        <w:tabs>
+          <w:tab w:val="left" w:pos="284"/>
+        </w:tabs>
         <w:rPr>
           <w:rFonts w:cs="Times New Roman"/>
         </w:rPr>
@@ -7725,6 +8559,9 @@
     </w:p>
     <w:p>
       <w:pPr>
+        <w:tabs>
+          <w:tab w:val="left" w:pos="284"/>
+        </w:tabs>
         <w:rPr>
           <w:rFonts w:cs="Times New Roman"/>
         </w:rPr>
@@ -7766,13 +8603,19 @@
     </w:p>
     <w:p>
       <w:pPr>
-        <w:rPr>
-          <w:rFonts w:cs="Times New Roman"/>
-        </w:rPr>
-      </w:pPr>
-    </w:p>
-    <w:p>
-      <w:pPr>
+        <w:tabs>
+          <w:tab w:val="left" w:pos="284"/>
+        </w:tabs>
+        <w:rPr>
+          <w:rFonts w:cs="Times New Roman"/>
+        </w:rPr>
+      </w:pPr>
+    </w:p>
+    <w:p>
+      <w:pPr>
+        <w:tabs>
+          <w:tab w:val="left" w:pos="284"/>
+        </w:tabs>
         <w:rPr>
           <w:rFonts w:cs="Times New Roman"/>
         </w:rPr>
@@ -7784,6 +8627,9 @@
           <w:ilvl w:val="0"/>
           <w:numId w:val="8"/>
         </w:numPr>
+        <w:tabs>
+          <w:tab w:val="left" w:pos="284"/>
+        </w:tabs>
         <w:rPr>
           <w:rFonts w:cs="Times New Roman"/>
           <w:b/>
@@ -7800,26 +8646,51 @@
       </w:r>
     </w:p>
     <w:p>
+      <w:pPr>
+        <w:tabs>
+          <w:tab w:val="left" w:pos="284"/>
+        </w:tabs>
+      </w:pPr>
       <w:r>
         <w:t>Bảng ảo (VIEW) được sử dụng nhằm đơn giản hóa việc truy vấn dữ liệu, hỗ trợ người dùng dễ dàng khai thác thông tin mà không cần thao tác trực tiếp trên nhiều bảng phức tạp.</w:t>
       </w:r>
     </w:p>
     <w:p>
+      <w:pPr>
+        <w:tabs>
+          <w:tab w:val="left" w:pos="284"/>
+        </w:tabs>
+      </w:pPr>
       <w:r>
         <w:t>VIEW_DanhSachBacSi:</w:t>
       </w:r>
     </w:p>
     <w:p>
+      <w:pPr>
+        <w:tabs>
+          <w:tab w:val="left" w:pos="284"/>
+        </w:tabs>
+      </w:pPr>
       <w:r>
         <w:t>Bảng ảo này dùng để hiển thị danh sách bác sĩ kèm theo phân cấp bậc dựa trên số năm kinh nghiệm.</w:t>
       </w:r>
     </w:p>
     <w:p>
+      <w:pPr>
+        <w:tabs>
+          <w:tab w:val="left" w:pos="284"/>
+        </w:tabs>
+      </w:pPr>
       <w:r>
         <w:t>Thông qua câu lệnh CASE, hệ thống tự động phân loại bác sĩ thành các mức như: thực tập sinh, bác sĩ tiêu chuẩn, chuyên môn cao hoặc chuyên gia. Điều này giúp dễ dàng đánh giá năng lực và phân công công việc.</w:t>
       </w:r>
     </w:p>
     <w:p>
+      <w:pPr>
+        <w:tabs>
+          <w:tab w:val="left" w:pos="284"/>
+        </w:tabs>
+      </w:pPr>
       <w:r>
         <w:rPr>
           <w:noProof/>
@@ -7875,24 +8746,50 @@
         </w:drawing>
       </w:r>
     </w:p>
-    <w:p/>
-    <w:p>
+    <w:p>
+      <w:pPr>
+        <w:tabs>
+          <w:tab w:val="left" w:pos="284"/>
+        </w:tabs>
+      </w:pPr>
+    </w:p>
+    <w:p>
+      <w:pPr>
+        <w:tabs>
+          <w:tab w:val="left" w:pos="284"/>
+        </w:tabs>
+      </w:pPr>
       <w:r>
         <w:t>VIEW_DanhSachThiHai:</w:t>
       </w:r>
     </w:p>
     <w:p>
+      <w:pPr>
+        <w:tabs>
+          <w:tab w:val="left" w:pos="284"/>
+        </w:tabs>
+      </w:pPr>
       <w:r>
         <w:lastRenderedPageBreak/>
         <w:t>Bảng ảo này dùng để phân loại thi hài theo nhóm tuổi tại thời điểm tử vong.</w:t>
       </w:r>
     </w:p>
     <w:p>
+      <w:pPr>
+        <w:tabs>
+          <w:tab w:val="left" w:pos="284"/>
+        </w:tabs>
+      </w:pPr>
       <w:r>
         <w:t>Dựa vào hàm DATEDIFF, hệ thống tính tuổi và chia thành các nhóm như: vị thành niên, trưởng thành và cao tuổi. Việc này hỗ trợ cho thống kê và phân tích nguyên nhân tử vong theo độ tuổi.</w:t>
       </w:r>
     </w:p>
     <w:p>
+      <w:pPr>
+        <w:tabs>
+          <w:tab w:val="left" w:pos="284"/>
+        </w:tabs>
+      </w:pPr>
       <w:r>
         <w:rPr>
           <w:noProof/>
@@ -7948,23 +8845,49 @@
         </w:drawing>
       </w:r>
     </w:p>
-    <w:p/>
-    <w:p>
+    <w:p>
+      <w:pPr>
+        <w:tabs>
+          <w:tab w:val="left" w:pos="284"/>
+        </w:tabs>
+      </w:pPr>
+    </w:p>
+    <w:p>
+      <w:pPr>
+        <w:tabs>
+          <w:tab w:val="left" w:pos="284"/>
+        </w:tabs>
+      </w:pPr>
       <w:r>
         <w:t>VIEW_DanhSachNganKeo:</w:t>
       </w:r>
     </w:p>
     <w:p>
+      <w:pPr>
+        <w:tabs>
+          <w:tab w:val="left" w:pos="284"/>
+        </w:tabs>
+      </w:pPr>
       <w:r>
         <w:t>Bảng ảo này kết hợp dữ liệu từ bảng NGANKEO và THIHAI nhằm hiển thị thông tin vị trí lưu trữ thi hài.</w:t>
       </w:r>
     </w:p>
     <w:p>
+      <w:pPr>
+        <w:tabs>
+          <w:tab w:val="left" w:pos="284"/>
+        </w:tabs>
+      </w:pPr>
       <w:r>
         <w:t>Chỉ những thi hài đã được phân vào ngăn kéo mới xuất hiện, giúp quản lý tình trạng lưu trữ một cách trực quan.</w:t>
       </w:r>
     </w:p>
     <w:p>
+      <w:pPr>
+        <w:tabs>
+          <w:tab w:val="left" w:pos="284"/>
+        </w:tabs>
+      </w:pPr>
       <w:r>
         <w:rPr>
           <w:noProof/>
@@ -8020,23 +8943,49 @@
         </w:drawing>
       </w:r>
     </w:p>
-    <w:p/>
-    <w:p>
+    <w:p>
+      <w:pPr>
+        <w:tabs>
+          <w:tab w:val="left" w:pos="284"/>
+        </w:tabs>
+      </w:pPr>
+    </w:p>
+    <w:p>
+      <w:pPr>
+        <w:tabs>
+          <w:tab w:val="left" w:pos="284"/>
+        </w:tabs>
+      </w:pPr>
       <w:r>
         <w:t>VIEW_HoSoKhamBenh:</w:t>
       </w:r>
     </w:p>
     <w:p>
+      <w:pPr>
+        <w:tabs>
+          <w:tab w:val="left" w:pos="284"/>
+        </w:tabs>
+      </w:pPr>
       <w:r>
         <w:t>Bảng ảo này hiển thị toàn bộ thông tin hồ sơ khám nghiệm.</w:t>
       </w:r>
     </w:p>
     <w:p>
+      <w:pPr>
+        <w:tabs>
+          <w:tab w:val="left" w:pos="284"/>
+        </w:tabs>
+      </w:pPr>
       <w:r>
         <w:t>Giúp người dùng dễ dàng truy cập dữ liệu mà không cần viết lại câu truy vấn SELECT phức tạp.</w:t>
       </w:r>
     </w:p>
     <w:p>
+      <w:pPr>
+        <w:tabs>
+          <w:tab w:val="left" w:pos="284"/>
+        </w:tabs>
+      </w:pPr>
       <w:r>
         <w:rPr>
           <w:noProof/>
@@ -8093,39 +9042,86 @@
         </w:drawing>
       </w:r>
     </w:p>
-    <w:p/>
-    <w:p>
+    <w:p>
+      <w:pPr>
+        <w:tabs>
+          <w:tab w:val="left" w:pos="284"/>
+        </w:tabs>
+      </w:pPr>
+    </w:p>
+    <w:p>
+      <w:pPr>
+        <w:tabs>
+          <w:tab w:val="left" w:pos="284"/>
+        </w:tabs>
+      </w:pPr>
       <w:r>
         <w:t>VIEW_DichVu:</w:t>
       </w:r>
     </w:p>
     <w:p>
+      <w:pPr>
+        <w:tabs>
+          <w:tab w:val="left" w:pos="284"/>
+        </w:tabs>
+      </w:pPr>
       <w:r>
         <w:t>Bảng ảo này cung cấp danh sách các dịch vụ hiện có trong hệ thống.</w:t>
       </w:r>
     </w:p>
     <w:p>
+      <w:pPr>
+        <w:tabs>
+          <w:tab w:val="left" w:pos="284"/>
+        </w:tabs>
+      </w:pPr>
       <w:r>
         <w:t>Phục vụ cho việc tra cứu nhanh thông tin dịch vụ.</w:t>
       </w:r>
     </w:p>
-    <w:p/>
-    <w:p>
+    <w:p>
+      <w:pPr>
+        <w:tabs>
+          <w:tab w:val="left" w:pos="284"/>
+        </w:tabs>
+      </w:pPr>
+    </w:p>
+    <w:p>
+      <w:pPr>
+        <w:tabs>
+          <w:tab w:val="left" w:pos="284"/>
+        </w:tabs>
+      </w:pPr>
       <w:r>
         <w:t>VIEW_DichVuE:</w:t>
       </w:r>
     </w:p>
     <w:p>
+      <w:pPr>
+        <w:tabs>
+          <w:tab w:val="left" w:pos="284"/>
+        </w:tabs>
+      </w:pPr>
       <w:r>
         <w:t>Bảng ảo này dùng để liệt kê các dịch vụ chưa từng được sử dụng.</w:t>
       </w:r>
     </w:p>
     <w:p>
+      <w:pPr>
+        <w:tabs>
+          <w:tab w:val="left" w:pos="284"/>
+        </w:tabs>
+      </w:pPr>
       <w:r>
         <w:t>Hỗ trợ nhà quản lý đánh giá hiệu quả khai thác dịch vụ và đưa ra quyết định cải thiện hoặc loại bỏ.</w:t>
       </w:r>
     </w:p>
     <w:p>
+      <w:pPr>
+        <w:tabs>
+          <w:tab w:val="left" w:pos="284"/>
+        </w:tabs>
+      </w:pPr>
       <w:r>
         <w:rPr>
           <w:noProof/>
@@ -8190,6 +9186,9 @@
           <w:ilvl w:val="0"/>
           <w:numId w:val="8"/>
         </w:numPr>
+        <w:tabs>
+          <w:tab w:val="left" w:pos="284"/>
+        </w:tabs>
         <w:rPr>
           <w:b/>
           <w:bCs/>
@@ -8203,8 +9202,15 @@
         <w:t>Truy vấn lồng (Subquery)</w:t>
       </w:r>
     </w:p>
-    <w:p/>
-    <w:p>
+    <w:p>
+      <w:pPr>
+        <w:tabs>
+          <w:tab w:val="left" w:pos="284"/>
+        </w:tabs>
+      </w:pPr>
+      <w:r>
+        <w:tab/>
+      </w:r>
       <w:r>
         <w:t>Truy vấn lồng được sử dụng để xử lý các bài toán cần so sánh dữ liệu với kết quả của một truy vấn khác.</w:t>
       </w:r>
@@ -8215,6 +9221,9 @@
           <w:ilvl w:val="0"/>
           <w:numId w:val="9"/>
         </w:numPr>
+        <w:tabs>
+          <w:tab w:val="left" w:pos="284"/>
+        </w:tabs>
       </w:pPr>
       <w:r>
         <w:t>Trong hệ thống, truy vấn lồng được áp dụng để tạo bảng ảo VIEW_BSLaoLang. Cụ thể, hệ thống lọc ra các bác sĩ có số năm kinh nghiệm lớn hơn mức trung bình của toàn bộ bác sĩ.</w:t>
@@ -8226,9 +9235,11 @@
           <w:ilvl w:val="0"/>
           <w:numId w:val="9"/>
         </w:numPr>
-      </w:pPr>
-      <w:r>
-        <w:lastRenderedPageBreak/>
+        <w:tabs>
+          <w:tab w:val="left" w:pos="284"/>
+        </w:tabs>
+      </w:pPr>
+      <w:r>
         <w:t>Truy vấn con (SELECT AVG(NAMKINHNGHIEM) FROM VIEW_DANHSACHBACSI) được dùng để tính giá trị trung bình. Kết quả này sau đó được sử dụng làm điều kiện so sánh trong truy vấn chính.</w:t>
       </w:r>
     </w:p>
@@ -8238,8 +9249,12 @@
           <w:ilvl w:val="0"/>
           <w:numId w:val="9"/>
         </w:numPr>
-      </w:pPr>
-      <w:r>
+        <w:tabs>
+          <w:tab w:val="left" w:pos="284"/>
+        </w:tabs>
+      </w:pPr>
+      <w:r>
+        <w:lastRenderedPageBreak/>
         <w:t>Cách tiếp cận này giúp xác định nhóm bác sĩ có trình độ cao một cách linh hoạt, không cần tính toán thủ công.</w:t>
       </w:r>
     </w:p>
@@ -8249,6 +9264,9 @@
           <w:ilvl w:val="0"/>
           <w:numId w:val="8"/>
         </w:numPr>
+        <w:tabs>
+          <w:tab w:val="left" w:pos="284"/>
+        </w:tabs>
         <w:rPr>
           <w:b/>
           <w:bCs/>
@@ -8374,29 +9392,66 @@
         <w:t>Sử dụng IF / CASE trong truy vấn</w:t>
       </w:r>
     </w:p>
-    <w:p/>
-    <w:p>
+    <w:p>
+      <w:pPr>
+        <w:tabs>
+          <w:tab w:val="left" w:pos="284"/>
+        </w:tabs>
+      </w:pPr>
+    </w:p>
+    <w:p>
+      <w:pPr>
+        <w:tabs>
+          <w:tab w:val="left" w:pos="284"/>
+        </w:tabs>
+      </w:pPr>
       <w:r>
         <w:t>Cấu trúc CASE được sử dụng để xử lý điều kiện trong SQL, tương tự như câu lệnh IF...ELSE trong các ngôn ngữ lập trình.</w:t>
       </w:r>
     </w:p>
-    <w:p/>
-    <w:p>
+    <w:p>
+      <w:pPr>
+        <w:tabs>
+          <w:tab w:val="left" w:pos="284"/>
+        </w:tabs>
+      </w:pPr>
+    </w:p>
+    <w:p>
+      <w:pPr>
+        <w:tabs>
+          <w:tab w:val="left" w:pos="284"/>
+        </w:tabs>
+      </w:pPr>
       <w:r>
         <w:t>Trong VIEW_DanhSachBacSi:</w:t>
       </w:r>
     </w:p>
     <w:p>
+      <w:pPr>
+        <w:tabs>
+          <w:tab w:val="left" w:pos="284"/>
+        </w:tabs>
+      </w:pPr>
       <w:r>
         <w:t>Câu lệnh CASE được dùng để phân loại cấp bậc bác sĩ dựa trên số năm kinh nghiệm.</w:t>
       </w:r>
     </w:p>
     <w:p>
+      <w:pPr>
+        <w:tabs>
+          <w:tab w:val="left" w:pos="284"/>
+        </w:tabs>
+      </w:pPr>
       <w:r>
         <w:t>Điều này giúp dữ liệu trở nên trực quan hơn thay vì chỉ hiển thị số liệu thô.</w:t>
       </w:r>
     </w:p>
     <w:p>
+      <w:pPr>
+        <w:tabs>
+          <w:tab w:val="left" w:pos="284"/>
+        </w:tabs>
+      </w:pPr>
       <w:r>
         <w:rPr>
           <w:noProof/>
@@ -8452,23 +9507,43 @@
         </w:drawing>
       </w:r>
     </w:p>
-    <w:p/>
-    <w:p>
+    <w:p>
+      <w:pPr>
+        <w:tabs>
+          <w:tab w:val="left" w:pos="284"/>
+        </w:tabs>
+      </w:pPr>
+    </w:p>
+    <w:p>
+      <w:pPr>
+        <w:tabs>
+          <w:tab w:val="left" w:pos="284"/>
+        </w:tabs>
+      </w:pPr>
       <w:r>
         <w:t>Trong VIEW_DanhSachThiHai:</w:t>
       </w:r>
     </w:p>
     <w:p>
+      <w:pPr>
+        <w:tabs>
+          <w:tab w:val="left" w:pos="284"/>
+        </w:tabs>
+      </w:pPr>
       <w:r>
         <w:t>Câu lệnh CASE được sử dụng để phân nhóm tuổi của thi hài.</w:t>
       </w:r>
     </w:p>
     <w:p>
+      <w:pPr>
+        <w:tabs>
+          <w:tab w:val="left" w:pos="284"/>
+        </w:tabs>
+      </w:pPr>
       <w:r>
         <w:rPr>
           <w:noProof/>
         </w:rPr>
-        <w:lastRenderedPageBreak/>
         <w:drawing>
           <wp:anchor distT="0" distB="0" distL="114300" distR="114300" simplePos="0" relativeHeight="251678720" behindDoc="0" locked="0" layoutInCell="1" allowOverlap="1" wp14:anchorId="71E05F5E" wp14:editId="47B791EF">
             <wp:simplePos x="0" y="0"/>
@@ -8524,9 +9599,26 @@
         <w:t>Việc này hỗ trợ cho các báo cáo thống kê và phân tích dữ liệu theo độ tuổi.</w:t>
       </w:r>
     </w:p>
-    <w:p/>
-    <w:p/>
-    <w:p>
+    <w:p>
+      <w:pPr>
+        <w:tabs>
+          <w:tab w:val="left" w:pos="284"/>
+        </w:tabs>
+      </w:pPr>
+    </w:p>
+    <w:p>
+      <w:pPr>
+        <w:tabs>
+          <w:tab w:val="left" w:pos="284"/>
+        </w:tabs>
+      </w:pPr>
+    </w:p>
+    <w:p>
+      <w:pPr>
+        <w:tabs>
+          <w:tab w:val="left" w:pos="284"/>
+        </w:tabs>
+      </w:pPr>
       <w:r>
         <w:t>Việc sử dụng CASE giúp:</w:t>
       </w:r>
@@ -8537,6 +9629,9 @@
           <w:ilvl w:val="0"/>
           <w:numId w:val="10"/>
         </w:numPr>
+        <w:tabs>
+          <w:tab w:val="left" w:pos="284"/>
+        </w:tabs>
       </w:pPr>
       <w:r>
         <w:t>Giảm xử lý ở phía ứng dụng</w:t>
@@ -8548,6 +9643,9 @@
           <w:ilvl w:val="0"/>
           <w:numId w:val="10"/>
         </w:numPr>
+        <w:tabs>
+          <w:tab w:val="left" w:pos="284"/>
+        </w:tabs>
       </w:pPr>
       <w:r>
         <w:t>Tăng tính trực quan của dữ liệu ngay tại tầng cơ sở dữ liệu</w:t>
@@ -8559,6 +9657,9 @@
           <w:ilvl w:val="0"/>
           <w:numId w:val="10"/>
         </w:numPr>
+        <w:tabs>
+          <w:tab w:val="left" w:pos="284"/>
+        </w:tabs>
       </w:pPr>
       <w:r>
         <w:t>Dễ dàng mở rộng thêm các điều kiện trong tương lai</w:t>
@@ -8566,20 +9667,29 @@
     </w:p>
     <w:p>
       <w:pPr>
-        <w:rPr>
-          <w:rFonts w:cs="Times New Roman"/>
-        </w:rPr>
-      </w:pPr>
-    </w:p>
-    <w:p>
-      <w:pPr>
-        <w:rPr>
-          <w:rFonts w:cs="Times New Roman"/>
-        </w:rPr>
-      </w:pPr>
-    </w:p>
-    <w:p>
-      <w:pPr>
+        <w:tabs>
+          <w:tab w:val="left" w:pos="284"/>
+        </w:tabs>
+        <w:rPr>
+          <w:rFonts w:cs="Times New Roman"/>
+        </w:rPr>
+      </w:pPr>
+    </w:p>
+    <w:p>
+      <w:pPr>
+        <w:tabs>
+          <w:tab w:val="left" w:pos="284"/>
+        </w:tabs>
+        <w:rPr>
+          <w:rFonts w:cs="Times New Roman"/>
+        </w:rPr>
+      </w:pPr>
+    </w:p>
+    <w:p>
+      <w:pPr>
+        <w:tabs>
+          <w:tab w:val="left" w:pos="284"/>
+        </w:tabs>
         <w:rPr>
           <w:rFonts w:cs="Times New Roman"/>
           <w:b/>
@@ -8597,10 +9707,19 @@
     </w:p>
     <w:p>
       <w:pPr>
-        <w:rPr>
-          <w:rFonts w:cs="Times New Roman"/>
-        </w:rPr>
-      </w:pPr>
+        <w:tabs>
+          <w:tab w:val="left" w:pos="284"/>
+        </w:tabs>
+        <w:rPr>
+          <w:rFonts w:cs="Times New Roman"/>
+        </w:rPr>
+      </w:pPr>
+      <w:r>
+        <w:rPr>
+          <w:rFonts w:cs="Times New Roman"/>
+        </w:rPr>
+        <w:tab/>
+      </w:r>
       <w:r>
         <w:rPr>
           <w:rFonts w:cs="Times New Roman"/>
@@ -8610,6 +9729,9 @@
     </w:p>
     <w:p>
       <w:pPr>
+        <w:tabs>
+          <w:tab w:val="left" w:pos="284"/>
+        </w:tabs>
         <w:rPr>
           <w:rFonts w:cs="Times New Roman"/>
         </w:rPr>
@@ -8623,6 +9745,9 @@
     </w:p>
     <w:p>
       <w:pPr>
+        <w:tabs>
+          <w:tab w:val="left" w:pos="284"/>
+        </w:tabs>
         <w:rPr>
           <w:rFonts w:cs="Times New Roman"/>
         </w:rPr>
@@ -8738,13 +9863,19 @@
     </w:p>
     <w:p>
       <w:pPr>
-        <w:rPr>
-          <w:rFonts w:cs="Times New Roman"/>
-        </w:rPr>
-      </w:pPr>
-    </w:p>
-    <w:p>
-      <w:pPr>
+        <w:tabs>
+          <w:tab w:val="left" w:pos="284"/>
+        </w:tabs>
+        <w:rPr>
+          <w:rFonts w:cs="Times New Roman"/>
+        </w:rPr>
+      </w:pPr>
+    </w:p>
+    <w:p>
+      <w:pPr>
+        <w:tabs>
+          <w:tab w:val="left" w:pos="284"/>
+        </w:tabs>
         <w:rPr>
           <w:rFonts w:cs="Times New Roman"/>
           <w:b/>
@@ -8762,10 +9893,19 @@
     </w:p>
     <w:p>
       <w:pPr>
-        <w:rPr>
-          <w:rFonts w:cs="Times New Roman"/>
-        </w:rPr>
-      </w:pPr>
+        <w:tabs>
+          <w:tab w:val="left" w:pos="284"/>
+        </w:tabs>
+        <w:rPr>
+          <w:rFonts w:cs="Times New Roman"/>
+        </w:rPr>
+      </w:pPr>
+      <w:r>
+        <w:rPr>
+          <w:rFonts w:cs="Times New Roman"/>
+        </w:rPr>
+        <w:tab/>
+      </w:r>
       <w:r>
         <w:rPr>
           <w:rFonts w:cs="Times New Roman"/>
@@ -8775,6 +9915,9 @@
     </w:p>
     <w:p>
       <w:pPr>
+        <w:tabs>
+          <w:tab w:val="left" w:pos="284"/>
+        </w:tabs>
         <w:rPr>
           <w:rFonts w:cs="Times New Roman"/>
         </w:rPr>
@@ -8795,15 +9938,17 @@
     </w:p>
     <w:p>
       <w:pPr>
-        <w:rPr>
-          <w:rFonts w:cs="Times New Roman"/>
-        </w:rPr>
-      </w:pPr>
-      <w:r>
-        <w:rPr>
-          <w:rFonts w:cs="Times New Roman"/>
-        </w:rPr>
-        <w:lastRenderedPageBreak/>
+        <w:tabs>
+          <w:tab w:val="left" w:pos="284"/>
+        </w:tabs>
+        <w:rPr>
+          <w:rFonts w:cs="Times New Roman"/>
+        </w:rPr>
+      </w:pPr>
+      <w:r>
+        <w:rPr>
+          <w:rFonts w:cs="Times New Roman"/>
+        </w:rPr>
         <w:t>Quản lý bác sĩ (BACSI):</w:t>
       </w:r>
       <w:r>
@@ -8816,6 +9961,9 @@
     </w:p>
     <w:p>
       <w:pPr>
+        <w:tabs>
+          <w:tab w:val="left" w:pos="284"/>
+        </w:tabs>
         <w:rPr>
           <w:rFonts w:cs="Times New Roman"/>
         </w:rPr>
@@ -8836,6 +9984,9 @@
     </w:p>
     <w:p>
       <w:pPr>
+        <w:tabs>
+          <w:tab w:val="left" w:pos="284"/>
+        </w:tabs>
         <w:rPr>
           <w:rFonts w:cs="Times New Roman"/>
         </w:rPr>
@@ -8856,14 +10007,18 @@
     </w:p>
     <w:p>
       <w:pPr>
-        <w:rPr>
-          <w:rFonts w:cs="Times New Roman"/>
-        </w:rPr>
-      </w:pPr>
-      <w:r>
-        <w:rPr>
-          <w:rFonts w:cs="Times New Roman"/>
-        </w:rPr>
+        <w:tabs>
+          <w:tab w:val="left" w:pos="284"/>
+        </w:tabs>
+        <w:rPr>
+          <w:rFonts w:cs="Times New Roman"/>
+        </w:rPr>
+      </w:pPr>
+      <w:r>
+        <w:rPr>
+          <w:rFonts w:cs="Times New Roman"/>
+        </w:rPr>
+        <w:lastRenderedPageBreak/>
         <w:t>Quản lý dịch vụ (DICHVU):</w:t>
       </w:r>
       <w:r>
@@ -8876,6 +10031,9 @@
     </w:p>
     <w:p>
       <w:pPr>
+        <w:tabs>
+          <w:tab w:val="left" w:pos="284"/>
+        </w:tabs>
         <w:rPr>
           <w:rFonts w:cs="Times New Roman"/>
         </w:rPr>
@@ -8896,6 +10054,9 @@
     </w:p>
     <w:p>
       <w:pPr>
+        <w:tabs>
+          <w:tab w:val="left" w:pos="284"/>
+        </w:tabs>
         <w:rPr>
           <w:rFonts w:cs="Times New Roman"/>
         </w:rPr>
@@ -8916,6 +10077,9 @@
     </w:p>
     <w:p>
       <w:pPr>
+        <w:tabs>
+          <w:tab w:val="left" w:pos="284"/>
+        </w:tabs>
         <w:rPr>
           <w:rFonts w:cs="Times New Roman"/>
         </w:rPr>
@@ -8936,6 +10100,9 @@
     </w:p>
     <w:p>
       <w:pPr>
+        <w:tabs>
+          <w:tab w:val="left" w:pos="284"/>
+        </w:tabs>
         <w:rPr>
           <w:rFonts w:cs="Times New Roman"/>
         </w:rPr>
@@ -8997,13 +10164,19 @@
     </w:p>
     <w:p>
       <w:pPr>
-        <w:rPr>
-          <w:rFonts w:cs="Times New Roman"/>
-        </w:rPr>
-      </w:pPr>
-    </w:p>
-    <w:p>
-      <w:pPr>
+        <w:tabs>
+          <w:tab w:val="left" w:pos="284"/>
+        </w:tabs>
+        <w:rPr>
+          <w:rFonts w:cs="Times New Roman"/>
+        </w:rPr>
+      </w:pPr>
+    </w:p>
+    <w:p>
+      <w:pPr>
+        <w:tabs>
+          <w:tab w:val="left" w:pos="284"/>
+        </w:tabs>
         <w:rPr>
           <w:rFonts w:cs="Times New Roman"/>
           <w:b/>
@@ -9021,10 +10194,19 @@
     </w:p>
     <w:p>
       <w:pPr>
-        <w:rPr>
-          <w:rFonts w:cs="Times New Roman"/>
-        </w:rPr>
-      </w:pPr>
+        <w:tabs>
+          <w:tab w:val="left" w:pos="284"/>
+        </w:tabs>
+        <w:rPr>
+          <w:rFonts w:cs="Times New Roman"/>
+        </w:rPr>
+      </w:pPr>
+      <w:r>
+        <w:rPr>
+          <w:rFonts w:cs="Times New Roman"/>
+        </w:rPr>
+        <w:tab/>
+      </w:r>
       <w:r>
         <w:rPr>
           <w:rFonts w:cs="Times New Roman"/>
@@ -9034,6 +10216,9 @@
     </w:p>
     <w:p>
       <w:pPr>
+        <w:tabs>
+          <w:tab w:val="left" w:pos="284"/>
+        </w:tabs>
         <w:rPr>
           <w:rFonts w:cs="Times New Roman"/>
         </w:rPr>
@@ -9054,6 +10239,9 @@
     </w:p>
     <w:p>
       <w:pPr>
+        <w:tabs>
+          <w:tab w:val="left" w:pos="284"/>
+        </w:tabs>
         <w:rPr>
           <w:rFonts w:cs="Times New Roman"/>
         </w:rPr>
@@ -9074,6 +10262,9 @@
     </w:p>
     <w:p>
       <w:pPr>
+        <w:tabs>
+          <w:tab w:val="left" w:pos="284"/>
+        </w:tabs>
         <w:rPr>
           <w:rFonts w:cs="Times New Roman"/>
         </w:rPr>
@@ -9094,6 +10285,9 @@
     </w:p>
     <w:p>
       <w:pPr>
+        <w:tabs>
+          <w:tab w:val="left" w:pos="284"/>
+        </w:tabs>
         <w:rPr>
           <w:rFonts w:cs="Times New Roman"/>
         </w:rPr>
@@ -9114,6 +10308,9 @@
     </w:p>
     <w:p>
       <w:pPr>
+        <w:tabs>
+          <w:tab w:val="left" w:pos="284"/>
+        </w:tabs>
         <w:rPr>
           <w:rFonts w:cs="Times New Roman"/>
         </w:rPr>
@@ -9134,13 +10331,19 @@
     </w:p>
     <w:p>
       <w:pPr>
-        <w:rPr>
-          <w:rFonts w:cs="Times New Roman"/>
-        </w:rPr>
-      </w:pPr>
-    </w:p>
-    <w:p>
-      <w:pPr>
+        <w:tabs>
+          <w:tab w:val="left" w:pos="284"/>
+        </w:tabs>
+        <w:rPr>
+          <w:rFonts w:cs="Times New Roman"/>
+        </w:rPr>
+      </w:pPr>
+    </w:p>
+    <w:p>
+      <w:pPr>
+        <w:tabs>
+          <w:tab w:val="left" w:pos="284"/>
+        </w:tabs>
         <w:rPr>
           <w:rFonts w:cs="Times New Roman"/>
           <w:b/>
@@ -9158,20 +10361,31 @@
     </w:p>
     <w:p>
       <w:pPr>
-        <w:rPr>
-          <w:rFonts w:cs="Times New Roman"/>
-        </w:rPr>
-      </w:pPr>
-      <w:r>
-        <w:rPr>
-          <w:rFonts w:cs="Times New Roman"/>
-        </w:rPr>
-        <w:lastRenderedPageBreak/>
+        <w:tabs>
+          <w:tab w:val="left" w:pos="284"/>
+        </w:tabs>
+        <w:rPr>
+          <w:rFonts w:cs="Times New Roman"/>
+        </w:rPr>
+      </w:pPr>
+      <w:r>
+        <w:rPr>
+          <w:rFonts w:cs="Times New Roman"/>
+        </w:rPr>
+        <w:tab/>
+      </w:r>
+      <w:r>
+        <w:rPr>
+          <w:rFonts w:cs="Times New Roman"/>
+        </w:rPr>
         <w:t>Hệ thống áp dụng các cơ chế kiểm soát nhằm đảm bảo người dùng chỉ được phép thực hiện các chức năng đúng với quyền hạn:</w:t>
       </w:r>
     </w:p>
     <w:p>
       <w:pPr>
+        <w:tabs>
+          <w:tab w:val="left" w:pos="284"/>
+        </w:tabs>
         <w:rPr>
           <w:rFonts w:cs="Times New Roman"/>
         </w:rPr>
@@ -9192,6 +10406,9 @@
     </w:p>
     <w:p>
       <w:pPr>
+        <w:tabs>
+          <w:tab w:val="left" w:pos="284"/>
+        </w:tabs>
         <w:rPr>
           <w:rFonts w:cs="Times New Roman"/>
         </w:rPr>
@@ -9212,14 +10429,18 @@
     </w:p>
     <w:p>
       <w:pPr>
-        <w:rPr>
-          <w:rFonts w:cs="Times New Roman"/>
-        </w:rPr>
-      </w:pPr>
-      <w:r>
-        <w:rPr>
-          <w:rFonts w:cs="Times New Roman"/>
-        </w:rPr>
+        <w:tabs>
+          <w:tab w:val="left" w:pos="284"/>
+        </w:tabs>
+        <w:rPr>
+          <w:rFonts w:cs="Times New Roman"/>
+        </w:rPr>
+      </w:pPr>
+      <w:r>
+        <w:rPr>
+          <w:rFonts w:cs="Times New Roman"/>
+        </w:rPr>
+        <w:lastRenderedPageBreak/>
         <w:t>Giới hạn thao tác dữ liệu:</w:t>
       </w:r>
       <w:r>
@@ -9232,13 +10453,19 @@
     </w:p>
     <w:p>
       <w:pPr>
-        <w:rPr>
-          <w:rFonts w:cs="Times New Roman"/>
-        </w:rPr>
-      </w:pPr>
-    </w:p>
-    <w:p>
-      <w:pPr>
+        <w:tabs>
+          <w:tab w:val="left" w:pos="284"/>
+        </w:tabs>
+        <w:rPr>
+          <w:rFonts w:cs="Times New Roman"/>
+        </w:rPr>
+      </w:pPr>
+    </w:p>
+    <w:p>
+      <w:pPr>
+        <w:tabs>
+          <w:tab w:val="left" w:pos="284"/>
+        </w:tabs>
         <w:rPr>
           <w:rFonts w:cs="Times New Roman"/>
           <w:b/>
@@ -9256,6 +10483,9 @@
     </w:p>
     <w:p>
       <w:pPr>
+        <w:tabs>
+          <w:tab w:val="left" w:pos="284"/>
+        </w:tabs>
         <w:rPr>
           <w:rFonts w:cs="Times New Roman"/>
         </w:rPr>
@@ -9273,6 +10503,9 @@
           <w:ilvl w:val="0"/>
           <w:numId w:val="11"/>
         </w:numPr>
+        <w:tabs>
+          <w:tab w:val="left" w:pos="284"/>
+        </w:tabs>
         <w:rPr>
           <w:rFonts w:cs="Times New Roman"/>
         </w:rPr>
@@ -9290,6 +10523,9 @@
           <w:ilvl w:val="0"/>
           <w:numId w:val="11"/>
         </w:numPr>
+        <w:tabs>
+          <w:tab w:val="left" w:pos="284"/>
+        </w:tabs>
         <w:rPr>
           <w:rFonts w:cs="Times New Roman"/>
         </w:rPr>
@@ -9307,6 +10543,9 @@
           <w:ilvl w:val="0"/>
           <w:numId w:val="11"/>
         </w:numPr>
+        <w:tabs>
+          <w:tab w:val="left" w:pos="284"/>
+        </w:tabs>
         <w:rPr>
           <w:rFonts w:cs="Times New Roman"/>
         </w:rPr>
@@ -9324,6 +10563,9 @@
           <w:ilvl w:val="0"/>
           <w:numId w:val="11"/>
         </w:numPr>
+        <w:tabs>
+          <w:tab w:val="left" w:pos="284"/>
+        </w:tabs>
         <w:rPr>
           <w:rFonts w:cs="Times New Roman"/>
         </w:rPr>
@@ -9337,13 +10579,19 @@
     </w:p>
     <w:p>
       <w:pPr>
-        <w:rPr>
-          <w:rFonts w:cs="Times New Roman"/>
-        </w:rPr>
-      </w:pPr>
-    </w:p>
-    <w:p>
-      <w:pPr>
+        <w:tabs>
+          <w:tab w:val="left" w:pos="284"/>
+        </w:tabs>
+        <w:rPr>
+          <w:rFonts w:cs="Times New Roman"/>
+        </w:rPr>
+      </w:pPr>
+    </w:p>
+    <w:p>
+      <w:pPr>
+        <w:tabs>
+          <w:tab w:val="left" w:pos="284"/>
+        </w:tabs>
         <w:rPr>
           <w:b/>
           <w:bCs/>
@@ -9361,7 +10609,7 @@
 </file>
 
 <file path=word/endnotes.xml><?xml version="1.0" encoding="utf-8"?>
-<w:endnotes xmlns:wpc="http://schemas.microsoft.com/office/word/2010/wordprocessingCanvas" xmlns:cx="http://schemas.microsoft.com/office/drawing/2014/chartex" xmlns:cx1="http://schemas.microsoft.com/office/drawing/2015/9/8/chartex" xmlns:cx2="http://schemas.microsoft.com/office/drawing/2015/10/21/chartex" xmlns:cx3="http://schemas.microsoft.com/office/drawing/2016/5/9/chartex" xmlns:cx4="http://schemas.microsoft.com/office/drawing/2016/5/10/chartex" xmlns:cx5="http://schemas.microsoft.com/office/drawing/2016/5/11/chartex" xmlns:cx6="http://schemas.microsoft.com/office/drawing/2016/5/12/chartex" xmlns:cx7="http://schemas.microsoft.com/office/drawing/2016/5/13/chartex" xmlns:cx8="http://schemas.microsoft.com/office/drawing/2016/5/14/chartex" xmlns:mc="http://schemas.openxmlformats.org/markup-compatibility/2006" xmlns:aink="http://schemas.microsoft.com/office/drawing/2016/ink" xmlns:am3d="http://schemas.microsoft.com/office/drawing/2017/model3d" xmlns:o="urn:schemas-microsoft-com:office:office" xmlns:oel="http://schemas.microsoft.com/office/2019/extlst" xmlns:r="http://schemas.openxmlformats.org/officeDocument/2006/relationships" xmlns:m="http://schemas.openxmlformats.org/officeDocument/2006/math" xmlns:v="urn:schemas-microsoft-com:vml" xmlns:wp14="http://schemas.microsoft.com/office/word/2010/wordprocessingDrawing" xmlns:wp="http://schemas.openxmlformats.org/drawingml/2006/wordprocessingDrawing" xmlns:w10="urn:schemas-microsoft-com:office:word" xmlns:w="http://schemas.openxmlformats.org/wordprocessingml/2006/main" xmlns:w14="http://schemas.microsoft.com/office/word/2010/wordml" xmlns:w15="http://schemas.microsoft.com/office/word/2012/wordml" xmlns:w16cex="http://schemas.microsoft.com/office/word/2018/wordml/cex" xmlns:w16cid="http://schemas.microsoft.com/office/word/2016/wordml/cid" xmlns:w16="http://schemas.microsoft.com/office/word/2018/wordml" xmlns:w16du="http://schemas.microsoft.com/office/word/2023/wordml/word16du" xmlns:w16sdtdh="http://schemas.microsoft.com/office/word/2020/wordml/sdtdatahash" xmlns:w16se="http://schemas.microsoft.com/office/word/2015/wordml/symex" xmlns:wpg="http://schemas.microsoft.com/office/word/2010/wordprocessingGroup" xmlns:wpi="http://schemas.microsoft.com/office/word/2010/wordprocessingInk" xmlns:wne="http://schemas.microsoft.com/office/word/2006/wordml" xmlns:wps="http://schemas.microsoft.com/office/word/2010/wordprocessingShape" mc:Ignorable="w14 w15 w16se w16cid w16 w16cex w16sdtdh w16du wp14">
+<w:endnotes xmlns:wpc="http://schemas.microsoft.com/office/word/2010/wordprocessingCanvas" xmlns:cx="http://schemas.microsoft.com/office/drawing/2014/chartex" xmlns:cx1="http://schemas.microsoft.com/office/drawing/2015/9/8/chartex" xmlns:cx2="http://schemas.microsoft.com/office/drawing/2015/10/21/chartex" xmlns:cx3="http://schemas.microsoft.com/office/drawing/2016/5/9/chartex" xmlns:cx4="http://schemas.microsoft.com/office/drawing/2016/5/10/chartex" xmlns:cx5="http://schemas.microsoft.com/office/drawing/2016/5/11/chartex" xmlns:cx6="http://schemas.microsoft.com/office/drawing/2016/5/12/chartex" xmlns:cx7="http://schemas.microsoft.com/office/drawing/2016/5/13/chartex" xmlns:cx8="http://schemas.microsoft.com/office/drawing/2016/5/14/chartex" xmlns:mc="http://schemas.openxmlformats.org/markup-compatibility/2006" xmlns:aink="http://schemas.microsoft.com/office/drawing/2016/ink" xmlns:am3d="http://schemas.microsoft.com/office/drawing/2017/model3d" xmlns:o="urn:schemas-microsoft-com:office:office" xmlns:oel="http://schemas.microsoft.com/office/2019/extlst" xmlns:r="http://schemas.openxmlformats.org/officeDocument/2006/relationships" xmlns:m="http://schemas.openxmlformats.org/officeDocument/2006/math" xmlns:v="urn:schemas-microsoft-com:vml" xmlns:wp14="http://schemas.microsoft.com/office/word/2010/wordprocessingDrawing" xmlns:wp="http://schemas.openxmlformats.org/drawingml/2006/wordprocessingDrawing" xmlns:w10="urn:schemas-microsoft-com:office:word" xmlns:w="http://schemas.openxmlformats.org/wordprocessingml/2006/main" xmlns:w14="http://schemas.microsoft.com/office/word/2010/wordml" xmlns:w15="http://schemas.microsoft.com/office/word/2012/wordml" xmlns:w16cex="http://schemas.microsoft.com/office/word/2018/wordml/cex" xmlns:w16cid="http://schemas.microsoft.com/office/word/2016/wordml/cid" xmlns:w16="http://schemas.microsoft.com/office/word/2018/wordml" xmlns:w16du="http://schemas.microsoft.com/office/word/2023/wordml/word16du" xmlns:w16sdtdh="http://schemas.microsoft.com/office/word/2020/wordml/sdtdatahash" xmlns:w16sdtfl="http://schemas.microsoft.com/office/word/2024/wordml/sdtformatlock" xmlns:w16se="http://schemas.microsoft.com/office/word/2015/wordml/symex" xmlns:wpg="http://schemas.microsoft.com/office/word/2010/wordprocessingGroup" xmlns:wpi="http://schemas.microsoft.com/office/word/2010/wordprocessingInk" xmlns:wne="http://schemas.microsoft.com/office/word/2006/wordml" xmlns:wps="http://schemas.microsoft.com/office/word/2010/wordprocessingShape" mc:Ignorable="w14 w15 w16se w16cid w16 w16cex w16sdtdh w16sdtfl w16du wp14">
   <w:endnote w:type="separator" w:id="-1">
     <w:p>
       <w:pPr>
@@ -9386,7 +10634,7 @@
 </file>
 
 <file path=word/footer1.xml><?xml version="1.0" encoding="utf-8"?>
-<w:ftr xmlns:wpc="http://schemas.microsoft.com/office/word/2010/wordprocessingCanvas" xmlns:cx="http://schemas.microsoft.com/office/drawing/2014/chartex" xmlns:cx1="http://schemas.microsoft.com/office/drawing/2015/9/8/chartex" xmlns:cx2="http://schemas.microsoft.com/office/drawing/2015/10/21/chartex" xmlns:cx3="http://schemas.microsoft.com/office/drawing/2016/5/9/chartex" xmlns:cx4="http://schemas.microsoft.com/office/drawing/2016/5/10/chartex" xmlns:cx5="http://schemas.microsoft.com/office/drawing/2016/5/11/chartex" xmlns:cx6="http://schemas.microsoft.com/office/drawing/2016/5/12/chartex" xmlns:cx7="http://schemas.microsoft.com/office/drawing/2016/5/13/chartex" xmlns:cx8="http://schemas.microsoft.com/office/drawing/2016/5/14/chartex" xmlns:mc="http://schemas.openxmlformats.org/markup-compatibility/2006" xmlns:aink="http://schemas.microsoft.com/office/drawing/2016/ink" xmlns:am3d="http://schemas.microsoft.com/office/drawing/2017/model3d" xmlns:o="urn:schemas-microsoft-com:office:office" xmlns:oel="http://schemas.microsoft.com/office/2019/extlst" xmlns:r="http://schemas.openxmlformats.org/officeDocument/2006/relationships" xmlns:m="http://schemas.openxmlformats.org/officeDocument/2006/math" xmlns:v="urn:schemas-microsoft-com:vml" xmlns:wp14="http://schemas.microsoft.com/office/word/2010/wordprocessingDrawing" xmlns:wp="http://schemas.openxmlformats.org/drawingml/2006/wordprocessingDrawing" xmlns:w10="urn:schemas-microsoft-com:office:word" xmlns:w="http://schemas.openxmlformats.org/wordprocessingml/2006/main" xmlns:w14="http://schemas.microsoft.com/office/word/2010/wordml" xmlns:w15="http://schemas.microsoft.com/office/word/2012/wordml" xmlns:w16cex="http://schemas.microsoft.com/office/word/2018/wordml/cex" xmlns:w16cid="http://schemas.microsoft.com/office/word/2016/wordml/cid" xmlns:w16="http://schemas.microsoft.com/office/word/2018/wordml" xmlns:w16du="http://schemas.microsoft.com/office/word/2023/wordml/word16du" xmlns:w16sdtdh="http://schemas.microsoft.com/office/word/2020/wordml/sdtdatahash" xmlns:w16se="http://schemas.microsoft.com/office/word/2015/wordml/symex" xmlns:wpg="http://schemas.microsoft.com/office/word/2010/wordprocessingGroup" xmlns:wpi="http://schemas.microsoft.com/office/word/2010/wordprocessingInk" xmlns:wne="http://schemas.microsoft.com/office/word/2006/wordml" xmlns:wps="http://schemas.microsoft.com/office/word/2010/wordprocessingShape" mc:Ignorable="w14 w15 w16se w16cid w16 w16cex w16sdtdh w16du wp14">
+<w:ftr xmlns:wpc="http://schemas.microsoft.com/office/word/2010/wordprocessingCanvas" xmlns:cx="http://schemas.microsoft.com/office/drawing/2014/chartex" xmlns:cx1="http://schemas.microsoft.com/office/drawing/2015/9/8/chartex" xmlns:cx2="http://schemas.microsoft.com/office/drawing/2015/10/21/chartex" xmlns:cx3="http://schemas.microsoft.com/office/drawing/2016/5/9/chartex" xmlns:cx4="http://schemas.microsoft.com/office/drawing/2016/5/10/chartex" xmlns:cx5="http://schemas.microsoft.com/office/drawing/2016/5/11/chartex" xmlns:cx6="http://schemas.microsoft.com/office/drawing/2016/5/12/chartex" xmlns:cx7="http://schemas.microsoft.com/office/drawing/2016/5/13/chartex" xmlns:cx8="http://schemas.microsoft.com/office/drawing/2016/5/14/chartex" xmlns:mc="http://schemas.openxmlformats.org/markup-compatibility/2006" xmlns:aink="http://schemas.microsoft.com/office/drawing/2016/ink" xmlns:am3d="http://schemas.microsoft.com/office/drawing/2017/model3d" xmlns:o="urn:schemas-microsoft-com:office:office" xmlns:oel="http://schemas.microsoft.com/office/2019/extlst" xmlns:r="http://schemas.openxmlformats.org/officeDocument/2006/relationships" xmlns:m="http://schemas.openxmlformats.org/officeDocument/2006/math" xmlns:v="urn:schemas-microsoft-com:vml" xmlns:wp14="http://schemas.microsoft.com/office/word/2010/wordprocessingDrawing" xmlns:wp="http://schemas.openxmlformats.org/drawingml/2006/wordprocessingDrawing" xmlns:w10="urn:schemas-microsoft-com:office:word" xmlns:w="http://schemas.openxmlformats.org/wordprocessingml/2006/main" xmlns:w14="http://schemas.microsoft.com/office/word/2010/wordml" xmlns:w15="http://schemas.microsoft.com/office/word/2012/wordml" xmlns:w16cex="http://schemas.microsoft.com/office/word/2018/wordml/cex" xmlns:w16cid="http://schemas.microsoft.com/office/word/2016/wordml/cid" xmlns:w16="http://schemas.microsoft.com/office/word/2018/wordml" xmlns:w16du="http://schemas.microsoft.com/office/word/2023/wordml/word16du" xmlns:w16sdtdh="http://schemas.microsoft.com/office/word/2020/wordml/sdtdatahash" xmlns:w16sdtfl="http://schemas.microsoft.com/office/word/2024/wordml/sdtformatlock" xmlns:w16se="http://schemas.microsoft.com/office/word/2015/wordml/symex" xmlns:wpg="http://schemas.microsoft.com/office/word/2010/wordprocessingGroup" xmlns:wpi="http://schemas.microsoft.com/office/word/2010/wordprocessingInk" xmlns:wne="http://schemas.microsoft.com/office/word/2006/wordml" xmlns:wps="http://schemas.microsoft.com/office/word/2010/wordprocessingShape" mc:Ignorable="w14 w15 w16se w16cid w16 w16cex w16sdtdh w16sdtfl w16du wp14">
   <w:sdt>
     <w:sdtPr>
       <w:id w:val="131912711"/>
@@ -9456,7 +10704,7 @@
 </file>
 
 <file path=word/footnotes.xml><?xml version="1.0" encoding="utf-8"?>
-<w:footnotes xmlns:wpc="http://schemas.microsoft.com/office/word/2010/wordprocessingCanvas" xmlns:cx="http://schemas.microsoft.com/office/drawing/2014/chartex" xmlns:cx1="http://schemas.microsoft.com/office/drawing/2015/9/8/chartex" xmlns:cx2="http://schemas.microsoft.com/office/drawing/2015/10/21/chartex" xmlns:cx3="http://schemas.microsoft.com/office/drawing/2016/5/9/chartex" xmlns:cx4="http://schemas.microsoft.com/office/drawing/2016/5/10/chartex" xmlns:cx5="http://schemas.microsoft.com/office/drawing/2016/5/11/chartex" xmlns:cx6="http://schemas.microsoft.com/office/drawing/2016/5/12/chartex" xmlns:cx7="http://schemas.microsoft.com/office/drawing/2016/5/13/chartex" xmlns:cx8="http://schemas.microsoft.com/office/drawing/2016/5/14/chartex" xmlns:mc="http://schemas.openxmlformats.org/markup-compatibility/2006" xmlns:aink="http://schemas.microsoft.com/office/drawing/2016/ink" xmlns:am3d="http://schemas.microsoft.com/office/drawing/2017/model3d" xmlns:o="urn:schemas-microsoft-com:office:office" xmlns:oel="http://schemas.microsoft.com/office/2019/extlst" xmlns:r="http://schemas.openxmlformats.org/officeDocument/2006/relationships" xmlns:m="http://schemas.openxmlformats.org/officeDocument/2006/math" xmlns:v="urn:schemas-microsoft-com:vml" xmlns:wp14="http://schemas.microsoft.com/office/word/2010/wordprocessingDrawing" xmlns:wp="http://schemas.openxmlformats.org/drawingml/2006/wordprocessingDrawing" xmlns:w10="urn:schemas-microsoft-com:office:word" xmlns:w="http://schemas.openxmlformats.org/wordprocessingml/2006/main" xmlns:w14="http://schemas.microsoft.com/office/word/2010/wordml" xmlns:w15="http://schemas.microsoft.com/office/word/2012/wordml" xmlns:w16cex="http://schemas.microsoft.com/office/word/2018/wordml/cex" xmlns:w16cid="http://schemas.microsoft.com/office/word/2016/wordml/cid" xmlns:w16="http://schemas.microsoft.com/office/word/2018/wordml" xmlns:w16du="http://schemas.microsoft.com/office/word/2023/wordml/word16du" xmlns:w16sdtdh="http://schemas.microsoft.com/office/word/2020/wordml/sdtdatahash" xmlns:w16se="http://schemas.microsoft.com/office/word/2015/wordml/symex" xmlns:wpg="http://schemas.microsoft.com/office/word/2010/wordprocessingGroup" xmlns:wpi="http://schemas.microsoft.com/office/word/2010/wordprocessingInk" xmlns:wne="http://schemas.microsoft.com/office/word/2006/wordml" xmlns:wps="http://schemas.microsoft.com/office/word/2010/wordprocessingShape" mc:Ignorable="w14 w15 w16se w16cid w16 w16cex w16sdtdh w16du wp14">
+<w:footnotes xmlns:wpc="http://schemas.microsoft.com/office/word/2010/wordprocessingCanvas" xmlns:cx="http://schemas.microsoft.com/office/drawing/2014/chartex" xmlns:cx1="http://schemas.microsoft.com/office/drawing/2015/9/8/chartex" xmlns:cx2="http://schemas.microsoft.com/office/drawing/2015/10/21/chartex" xmlns:cx3="http://schemas.microsoft.com/office/drawing/2016/5/9/chartex" xmlns:cx4="http://schemas.microsoft.com/office/drawing/2016/5/10/chartex" xmlns:cx5="http://schemas.microsoft.com/office/drawing/2016/5/11/chartex" xmlns:cx6="http://schemas.microsoft.com/office/drawing/2016/5/12/chartex" xmlns:cx7="http://schemas.microsoft.com/office/drawing/2016/5/13/chartex" xmlns:cx8="http://schemas.microsoft.com/office/drawing/2016/5/14/chartex" xmlns:mc="http://schemas.openxmlformats.org/markup-compatibility/2006" xmlns:aink="http://schemas.microsoft.com/office/drawing/2016/ink" xmlns:am3d="http://schemas.microsoft.com/office/drawing/2017/model3d" xmlns:o="urn:schemas-microsoft-com:office:office" xmlns:oel="http://schemas.microsoft.com/office/2019/extlst" xmlns:r="http://schemas.openxmlformats.org/officeDocument/2006/relationships" xmlns:m="http://schemas.openxmlformats.org/officeDocument/2006/math" xmlns:v="urn:schemas-microsoft-com:vml" xmlns:wp14="http://schemas.microsoft.com/office/word/2010/wordprocessingDrawing" xmlns:wp="http://schemas.openxmlformats.org/drawingml/2006/wordprocessingDrawing" xmlns:w10="urn:schemas-microsoft-com:office:word" xmlns:w="http://schemas.openxmlformats.org/wordprocessingml/2006/main" xmlns:w14="http://schemas.microsoft.com/office/word/2010/wordml" xmlns:w15="http://schemas.microsoft.com/office/word/2012/wordml" xmlns:w16cex="http://schemas.microsoft.com/office/word/2018/wordml/cex" xmlns:w16cid="http://schemas.microsoft.com/office/word/2016/wordml/cid" xmlns:w16="http://schemas.microsoft.com/office/word/2018/wordml" xmlns:w16du="http://schemas.microsoft.com/office/word/2023/wordml/word16du" xmlns:w16sdtdh="http://schemas.microsoft.com/office/word/2020/wordml/sdtdatahash" xmlns:w16sdtfl="http://schemas.microsoft.com/office/word/2024/wordml/sdtformatlock" xmlns:w16se="http://schemas.microsoft.com/office/word/2015/wordml/symex" xmlns:wpg="http://schemas.microsoft.com/office/word/2010/wordprocessingGroup" xmlns:wpi="http://schemas.microsoft.com/office/word/2010/wordprocessingInk" xmlns:wne="http://schemas.microsoft.com/office/word/2006/wordml" xmlns:wps="http://schemas.microsoft.com/office/word/2010/wordprocessingShape" mc:Ignorable="w14 w15 w16se w16cid w16 w16cex w16sdtdh w16sdtfl w16du wp14">
   <w:footnote w:type="separator" w:id="-1">
     <w:p>
       <w:pPr>
@@ -9481,7 +10729,7 @@
 </file>
 
 <file path=word/header1.xml><?xml version="1.0" encoding="utf-8"?>
-<w:hdr xmlns:wpc="http://schemas.microsoft.com/office/word/2010/wordprocessingCanvas" xmlns:cx="http://schemas.microsoft.com/office/drawing/2014/chartex" xmlns:cx1="http://schemas.microsoft.com/office/drawing/2015/9/8/chartex" xmlns:cx2="http://schemas.microsoft.com/office/drawing/2015/10/21/chartex" xmlns:cx3="http://schemas.microsoft.com/office/drawing/2016/5/9/chartex" xmlns:cx4="http://schemas.microsoft.com/office/drawing/2016/5/10/chartex" xmlns:cx5="http://schemas.microsoft.com/office/drawing/2016/5/11/chartex" xmlns:cx6="http://schemas.microsoft.com/office/drawing/2016/5/12/chartex" xmlns:cx7="http://schemas.microsoft.com/office/drawing/2016/5/13/chartex" xmlns:cx8="http://schemas.microsoft.com/office/drawing/2016/5/14/chartex" xmlns:mc="http://schemas.openxmlformats.org/markup-compatibility/2006" xmlns:aink="http://schemas.microsoft.com/office/drawing/2016/ink" xmlns:am3d="http://schemas.microsoft.com/office/drawing/2017/model3d" xmlns:o="urn:schemas-microsoft-com:office:office" xmlns:oel="http://schemas.microsoft.com/office/2019/extlst" xmlns:r="http://schemas.openxmlformats.org/officeDocument/2006/relationships" xmlns:m="http://schemas.openxmlformats.org/officeDocument/2006/math" xmlns:v="urn:schemas-microsoft-com:vml" xmlns:wp14="http://schemas.microsoft.com/office/word/2010/wordprocessingDrawing" xmlns:wp="http://schemas.openxmlformats.org/drawingml/2006/wordprocessingDrawing" xmlns:w10="urn:schemas-microsoft-com:office:word" xmlns:w="http://schemas.openxmlformats.org/wordprocessingml/2006/main" xmlns:w14="http://schemas.microsoft.com/office/word/2010/wordml" xmlns:w15="http://schemas.microsoft.com/office/word/2012/wordml" xmlns:w16cex="http://schemas.microsoft.com/office/word/2018/wordml/cex" xmlns:w16cid="http://schemas.microsoft.com/office/word/2016/wordml/cid" xmlns:w16="http://schemas.microsoft.com/office/word/2018/wordml" xmlns:w16du="http://schemas.microsoft.com/office/word/2023/wordml/word16du" xmlns:w16sdtdh="http://schemas.microsoft.com/office/word/2020/wordml/sdtdatahash" xmlns:w16se="http://schemas.microsoft.com/office/word/2015/wordml/symex" xmlns:wpg="http://schemas.microsoft.com/office/word/2010/wordprocessingGroup" xmlns:wpi="http://schemas.microsoft.com/office/word/2010/wordprocessingInk" xmlns:wne="http://schemas.microsoft.com/office/word/2006/wordml" xmlns:wps="http://schemas.microsoft.com/office/word/2010/wordprocessingShape" mc:Ignorable="w14 w15 w16se w16cid w16 w16cex w16sdtdh w16du wp14">
+<w:hdr xmlns:wpc="http://schemas.microsoft.com/office/word/2010/wordprocessingCanvas" xmlns:cx="http://schemas.microsoft.com/office/drawing/2014/chartex" xmlns:cx1="http://schemas.microsoft.com/office/drawing/2015/9/8/chartex" xmlns:cx2="http://schemas.microsoft.com/office/drawing/2015/10/21/chartex" xmlns:cx3="http://schemas.microsoft.com/office/drawing/2016/5/9/chartex" xmlns:cx4="http://schemas.microsoft.com/office/drawing/2016/5/10/chartex" xmlns:cx5="http://schemas.microsoft.com/office/drawing/2016/5/11/chartex" xmlns:cx6="http://schemas.microsoft.com/office/drawing/2016/5/12/chartex" xmlns:cx7="http://schemas.microsoft.com/office/drawing/2016/5/13/chartex" xmlns:cx8="http://schemas.microsoft.com/office/drawing/2016/5/14/chartex" xmlns:mc="http://schemas.openxmlformats.org/markup-compatibility/2006" xmlns:aink="http://schemas.microsoft.com/office/drawing/2016/ink" xmlns:am3d="http://schemas.microsoft.com/office/drawing/2017/model3d" xmlns:o="urn:schemas-microsoft-com:office:office" xmlns:oel="http://schemas.microsoft.com/office/2019/extlst" xmlns:r="http://schemas.openxmlformats.org/officeDocument/2006/relationships" xmlns:m="http://schemas.openxmlformats.org/officeDocument/2006/math" xmlns:v="urn:schemas-microsoft-com:vml" xmlns:wp14="http://schemas.microsoft.com/office/word/2010/wordprocessingDrawing" xmlns:wp="http://schemas.openxmlformats.org/drawingml/2006/wordprocessingDrawing" xmlns:w10="urn:schemas-microsoft-com:office:word" xmlns:w="http://schemas.openxmlformats.org/wordprocessingml/2006/main" xmlns:w14="http://schemas.microsoft.com/office/word/2010/wordml" xmlns:w15="http://schemas.microsoft.com/office/word/2012/wordml" xmlns:w16cex="http://schemas.microsoft.com/office/word/2018/wordml/cex" xmlns:w16cid="http://schemas.microsoft.com/office/word/2016/wordml/cid" xmlns:w16="http://schemas.microsoft.com/office/word/2018/wordml" xmlns:w16du="http://schemas.microsoft.com/office/word/2023/wordml/word16du" xmlns:w16sdtdh="http://schemas.microsoft.com/office/word/2020/wordml/sdtdatahash" xmlns:w16sdtfl="http://schemas.microsoft.com/office/word/2024/wordml/sdtformatlock" xmlns:w16se="http://schemas.microsoft.com/office/word/2015/wordml/symex" xmlns:wpg="http://schemas.microsoft.com/office/word/2010/wordprocessingGroup" xmlns:wpi="http://schemas.microsoft.com/office/word/2010/wordprocessingInk" xmlns:wne="http://schemas.microsoft.com/office/word/2006/wordml" xmlns:wps="http://schemas.microsoft.com/office/word/2010/wordprocessingShape" mc:Ignorable="w14 w15 w16se w16cid w16 w16cex w16sdtdh w16sdtfl w16du wp14">
   <w:p>
     <w:pPr>
       <w:pStyle w:val="Header"/>
@@ -9504,7 +10752,7 @@
 </file>
 
 <file path=word/numbering.xml><?xml version="1.0" encoding="utf-8"?>
-<w:numbering xmlns:wpc="http://schemas.microsoft.com/office/word/2010/wordprocessingCanvas" xmlns:cx="http://schemas.microsoft.com/office/drawing/2014/chartex" xmlns:cx1="http://schemas.microsoft.com/office/drawing/2015/9/8/chartex" xmlns:cx2="http://schemas.microsoft.com/office/drawing/2015/10/21/chartex" xmlns:cx3="http://schemas.microsoft.com/office/drawing/2016/5/9/chartex" xmlns:cx4="http://schemas.microsoft.com/office/drawing/2016/5/10/chartex" xmlns:cx5="http://schemas.microsoft.com/office/drawing/2016/5/11/chartex" xmlns:cx6="http://schemas.microsoft.com/office/drawing/2016/5/12/chartex" xmlns:cx7="http://schemas.microsoft.com/office/drawing/2016/5/13/chartex" xmlns:cx8="http://schemas.microsoft.com/office/drawing/2016/5/14/chartex" xmlns:mc="http://schemas.openxmlformats.org/markup-compatibility/2006" xmlns:aink="http://schemas.microsoft.com/office/drawing/2016/ink" xmlns:am3d="http://schemas.microsoft.com/office/drawing/2017/model3d" xmlns:o="urn:schemas-microsoft-com:office:office" xmlns:oel="http://schemas.microsoft.com/office/2019/extlst" xmlns:r="http://schemas.openxmlformats.org/officeDocument/2006/relationships" xmlns:m="http://schemas.openxmlformats.org/officeDocument/2006/math" xmlns:v="urn:schemas-microsoft-com:vml" xmlns:wp14="http://schemas.microsoft.com/office/word/2010/wordprocessingDrawing" xmlns:wp="http://schemas.openxmlformats.org/drawingml/2006/wordprocessingDrawing" xmlns:w10="urn:schemas-microsoft-com:office:word" xmlns:w="http://schemas.openxmlformats.org/wordprocessingml/2006/main" xmlns:w14="http://schemas.microsoft.com/office/word/2010/wordml" xmlns:w15="http://schemas.microsoft.com/office/word/2012/wordml" xmlns:w16cex="http://schemas.microsoft.com/office/word/2018/wordml/cex" xmlns:w16cid="http://schemas.microsoft.com/office/word/2016/wordml/cid" xmlns:w16="http://schemas.microsoft.com/office/word/2018/wordml" xmlns:w16du="http://schemas.microsoft.com/office/word/2023/wordml/word16du" xmlns:w16sdtdh="http://schemas.microsoft.com/office/word/2020/wordml/sdtdatahash" xmlns:w16se="http://schemas.microsoft.com/office/word/2015/wordml/symex" xmlns:wpg="http://schemas.microsoft.com/office/word/2010/wordprocessingGroup" xmlns:wpi="http://schemas.microsoft.com/office/word/2010/wordprocessingInk" xmlns:wne="http://schemas.microsoft.com/office/word/2006/wordml" xmlns:wps="http://schemas.microsoft.com/office/word/2010/wordprocessingShape" mc:Ignorable="w14 w15 w16se w16cid w16 w16cex w16sdtdh w16du wp14">
+<w:numbering xmlns:wpc="http://schemas.microsoft.com/office/word/2010/wordprocessingCanvas" xmlns:cx="http://schemas.microsoft.com/office/drawing/2014/chartex" xmlns:cx1="http://schemas.microsoft.com/office/drawing/2015/9/8/chartex" xmlns:cx2="http://schemas.microsoft.com/office/drawing/2015/10/21/chartex" xmlns:cx3="http://schemas.microsoft.com/office/drawing/2016/5/9/chartex" xmlns:cx4="http://schemas.microsoft.com/office/drawing/2016/5/10/chartex" xmlns:cx5="http://schemas.microsoft.com/office/drawing/2016/5/11/chartex" xmlns:cx6="http://schemas.microsoft.com/office/drawing/2016/5/12/chartex" xmlns:cx7="http://schemas.microsoft.com/office/drawing/2016/5/13/chartex" xmlns:cx8="http://schemas.microsoft.com/office/drawing/2016/5/14/chartex" xmlns:mc="http://schemas.openxmlformats.org/markup-compatibility/2006" xmlns:aink="http://schemas.microsoft.com/office/drawing/2016/ink" xmlns:am3d="http://schemas.microsoft.com/office/drawing/2017/model3d" xmlns:o="urn:schemas-microsoft-com:office:office" xmlns:oel="http://schemas.microsoft.com/office/2019/extlst" xmlns:r="http://schemas.openxmlformats.org/officeDocument/2006/relationships" xmlns:m="http://schemas.openxmlformats.org/officeDocument/2006/math" xmlns:v="urn:schemas-microsoft-com:vml" xmlns:wp14="http://schemas.microsoft.com/office/word/2010/wordprocessingDrawing" xmlns:wp="http://schemas.openxmlformats.org/drawingml/2006/wordprocessingDrawing" xmlns:w10="urn:schemas-microsoft-com:office:word" xmlns:w="http://schemas.openxmlformats.org/wordprocessingml/2006/main" xmlns:w14="http://schemas.microsoft.com/office/word/2010/wordml" xmlns:w15="http://schemas.microsoft.com/office/word/2012/wordml" xmlns:w16cex="http://schemas.microsoft.com/office/word/2018/wordml/cex" xmlns:w16cid="http://schemas.microsoft.com/office/word/2016/wordml/cid" xmlns:w16="http://schemas.microsoft.com/office/word/2018/wordml" xmlns:w16du="http://schemas.microsoft.com/office/word/2023/wordml/word16du" xmlns:w16sdtdh="http://schemas.microsoft.com/office/word/2020/wordml/sdtdatahash" xmlns:w16sdtfl="http://schemas.microsoft.com/office/word/2024/wordml/sdtformatlock" xmlns:w16se="http://schemas.microsoft.com/office/word/2015/wordml/symex" xmlns:wpg="http://schemas.microsoft.com/office/word/2010/wordprocessingGroup" xmlns:wpi="http://schemas.microsoft.com/office/word/2010/wordprocessingInk" xmlns:wne="http://schemas.microsoft.com/office/word/2006/wordml" xmlns:wps="http://schemas.microsoft.com/office/word/2010/wordprocessingShape" mc:Ignorable="w14 w15 w16se w16cid w16 w16cex w16sdtdh w16sdtfl w16du wp14">
   <w:abstractNum w:abstractNumId="0" w15:restartNumberingAfterBreak="0">
     <w:nsid w:val="D7CEFA40"/>
     <w:multiLevelType w:val="singleLevel"/>
@@ -10474,6 +11722,232 @@
     </w:lvl>
   </w:abstractNum>
   <w:abstractNum w:abstractNumId="10" w15:restartNumberingAfterBreak="0">
+    <w:nsid w:val="70A9547C"/>
+    <w:multiLevelType w:val="hybridMultilevel"/>
+    <w:tmpl w:val="3C0889FC"/>
+    <w:lvl w:ilvl="0" w:tplc="93B4E29C">
+      <w:start w:val="8"/>
+      <w:numFmt w:val="bullet"/>
+      <w:lvlText w:val="-"/>
+      <w:lvlJc w:val="left"/>
+      <w:pPr>
+        <w:ind w:left="720" w:hanging="360"/>
+      </w:pPr>
+      <w:rPr>
+        <w:rFonts w:ascii="Times New Roman" w:eastAsiaTheme="minorHAnsi" w:hAnsi="Times New Roman" w:cs="Times New Roman" w:hint="default"/>
+      </w:rPr>
+    </w:lvl>
+    <w:lvl w:ilvl="1" w:tplc="04090003" w:tentative="1">
+      <w:start w:val="1"/>
+      <w:numFmt w:val="bullet"/>
+      <w:lvlText w:val="o"/>
+      <w:lvlJc w:val="left"/>
+      <w:pPr>
+        <w:ind w:left="1440" w:hanging="360"/>
+      </w:pPr>
+      <w:rPr>
+        <w:rFonts w:ascii="Courier New" w:hAnsi="Courier New" w:cs="Courier New" w:hint="default"/>
+      </w:rPr>
+    </w:lvl>
+    <w:lvl w:ilvl="2" w:tplc="04090005" w:tentative="1">
+      <w:start w:val="1"/>
+      <w:numFmt w:val="bullet"/>
+      <w:lvlText w:val=""/>
+      <w:lvlJc w:val="left"/>
+      <w:pPr>
+        <w:ind w:left="2160" w:hanging="360"/>
+      </w:pPr>
+      <w:rPr>
+        <w:rFonts w:ascii="Wingdings" w:hAnsi="Wingdings" w:hint="default"/>
+      </w:rPr>
+    </w:lvl>
+    <w:lvl w:ilvl="3" w:tplc="04090001" w:tentative="1">
+      <w:start w:val="1"/>
+      <w:numFmt w:val="bullet"/>
+      <w:lvlText w:val=""/>
+      <w:lvlJc w:val="left"/>
+      <w:pPr>
+        <w:ind w:left="2880" w:hanging="360"/>
+      </w:pPr>
+      <w:rPr>
+        <w:rFonts w:ascii="Symbol" w:hAnsi="Symbol" w:hint="default"/>
+      </w:rPr>
+    </w:lvl>
+    <w:lvl w:ilvl="4" w:tplc="04090003" w:tentative="1">
+      <w:start w:val="1"/>
+      <w:numFmt w:val="bullet"/>
+      <w:lvlText w:val="o"/>
+      <w:lvlJc w:val="left"/>
+      <w:pPr>
+        <w:ind w:left="3600" w:hanging="360"/>
+      </w:pPr>
+      <w:rPr>
+        <w:rFonts w:ascii="Courier New" w:hAnsi="Courier New" w:cs="Courier New" w:hint="default"/>
+      </w:rPr>
+    </w:lvl>
+    <w:lvl w:ilvl="5" w:tplc="04090005" w:tentative="1">
+      <w:start w:val="1"/>
+      <w:numFmt w:val="bullet"/>
+      <w:lvlText w:val=""/>
+      <w:lvlJc w:val="left"/>
+      <w:pPr>
+        <w:ind w:left="4320" w:hanging="360"/>
+      </w:pPr>
+      <w:rPr>
+        <w:rFonts w:ascii="Wingdings" w:hAnsi="Wingdings" w:hint="default"/>
+      </w:rPr>
+    </w:lvl>
+    <w:lvl w:ilvl="6" w:tplc="04090001" w:tentative="1">
+      <w:start w:val="1"/>
+      <w:numFmt w:val="bullet"/>
+      <w:lvlText w:val=""/>
+      <w:lvlJc w:val="left"/>
+      <w:pPr>
+        <w:ind w:left="5040" w:hanging="360"/>
+      </w:pPr>
+      <w:rPr>
+        <w:rFonts w:ascii="Symbol" w:hAnsi="Symbol" w:hint="default"/>
+      </w:rPr>
+    </w:lvl>
+    <w:lvl w:ilvl="7" w:tplc="04090003" w:tentative="1">
+      <w:start w:val="1"/>
+      <w:numFmt w:val="bullet"/>
+      <w:lvlText w:val="o"/>
+      <w:lvlJc w:val="left"/>
+      <w:pPr>
+        <w:ind w:left="5760" w:hanging="360"/>
+      </w:pPr>
+      <w:rPr>
+        <w:rFonts w:ascii="Courier New" w:hAnsi="Courier New" w:cs="Courier New" w:hint="default"/>
+      </w:rPr>
+    </w:lvl>
+    <w:lvl w:ilvl="8" w:tplc="04090005" w:tentative="1">
+      <w:start w:val="1"/>
+      <w:numFmt w:val="bullet"/>
+      <w:lvlText w:val=""/>
+      <w:lvlJc w:val="left"/>
+      <w:pPr>
+        <w:ind w:left="6480" w:hanging="360"/>
+      </w:pPr>
+      <w:rPr>
+        <w:rFonts w:ascii="Wingdings" w:hAnsi="Wingdings" w:hint="default"/>
+      </w:rPr>
+    </w:lvl>
+  </w:abstractNum>
+  <w:abstractNum w:abstractNumId="11" w15:restartNumberingAfterBreak="0">
+    <w:nsid w:val="746637D4"/>
+    <w:multiLevelType w:val="hybridMultilevel"/>
+    <w:tmpl w:val="A0382D92"/>
+    <w:lvl w:ilvl="0" w:tplc="70505176">
+      <w:start w:val="8"/>
+      <w:numFmt w:val="bullet"/>
+      <w:lvlText w:val="-"/>
+      <w:lvlJc w:val="left"/>
+      <w:pPr>
+        <w:ind w:left="720" w:hanging="360"/>
+      </w:pPr>
+      <w:rPr>
+        <w:rFonts w:ascii="Times New Roman" w:eastAsiaTheme="minorHAnsi" w:hAnsi="Times New Roman" w:cs="Times New Roman" w:hint="default"/>
+      </w:rPr>
+    </w:lvl>
+    <w:lvl w:ilvl="1" w:tplc="04090003" w:tentative="1">
+      <w:start w:val="1"/>
+      <w:numFmt w:val="bullet"/>
+      <w:lvlText w:val="o"/>
+      <w:lvlJc w:val="left"/>
+      <w:pPr>
+        <w:ind w:left="1440" w:hanging="360"/>
+      </w:pPr>
+      <w:rPr>
+        <w:rFonts w:ascii="Courier New" w:hAnsi="Courier New" w:cs="Courier New" w:hint="default"/>
+      </w:rPr>
+    </w:lvl>
+    <w:lvl w:ilvl="2" w:tplc="04090005" w:tentative="1">
+      <w:start w:val="1"/>
+      <w:numFmt w:val="bullet"/>
+      <w:lvlText w:val=""/>
+      <w:lvlJc w:val="left"/>
+      <w:pPr>
+        <w:ind w:left="2160" w:hanging="360"/>
+      </w:pPr>
+      <w:rPr>
+        <w:rFonts w:ascii="Wingdings" w:hAnsi="Wingdings" w:hint="default"/>
+      </w:rPr>
+    </w:lvl>
+    <w:lvl w:ilvl="3" w:tplc="04090001" w:tentative="1">
+      <w:start w:val="1"/>
+      <w:numFmt w:val="bullet"/>
+      <w:lvlText w:val=""/>
+      <w:lvlJc w:val="left"/>
+      <w:pPr>
+        <w:ind w:left="2880" w:hanging="360"/>
+      </w:pPr>
+      <w:rPr>
+        <w:rFonts w:ascii="Symbol" w:hAnsi="Symbol" w:hint="default"/>
+      </w:rPr>
+    </w:lvl>
+    <w:lvl w:ilvl="4" w:tplc="04090003" w:tentative="1">
+      <w:start w:val="1"/>
+      <w:numFmt w:val="bullet"/>
+      <w:lvlText w:val="o"/>
+      <w:lvlJc w:val="left"/>
+      <w:pPr>
+        <w:ind w:left="3600" w:hanging="360"/>
+      </w:pPr>
+      <w:rPr>
+        <w:rFonts w:ascii="Courier New" w:hAnsi="Courier New" w:cs="Courier New" w:hint="default"/>
+      </w:rPr>
+    </w:lvl>
+    <w:lvl w:ilvl="5" w:tplc="04090005" w:tentative="1">
+      <w:start w:val="1"/>
+      <w:numFmt w:val="bullet"/>
+      <w:lvlText w:val=""/>
+      <w:lvlJc w:val="left"/>
+      <w:pPr>
+        <w:ind w:left="4320" w:hanging="360"/>
+      </w:pPr>
+      <w:rPr>
+        <w:rFonts w:ascii="Wingdings" w:hAnsi="Wingdings" w:hint="default"/>
+      </w:rPr>
+    </w:lvl>
+    <w:lvl w:ilvl="6" w:tplc="04090001" w:tentative="1">
+      <w:start w:val="1"/>
+      <w:numFmt w:val="bullet"/>
+      <w:lvlText w:val=""/>
+      <w:lvlJc w:val="left"/>
+      <w:pPr>
+        <w:ind w:left="5040" w:hanging="360"/>
+      </w:pPr>
+      <w:rPr>
+        <w:rFonts w:ascii="Symbol" w:hAnsi="Symbol" w:hint="default"/>
+      </w:rPr>
+    </w:lvl>
+    <w:lvl w:ilvl="7" w:tplc="04090003" w:tentative="1">
+      <w:start w:val="1"/>
+      <w:numFmt w:val="bullet"/>
+      <w:lvlText w:val="o"/>
+      <w:lvlJc w:val="left"/>
+      <w:pPr>
+        <w:ind w:left="5760" w:hanging="360"/>
+      </w:pPr>
+      <w:rPr>
+        <w:rFonts w:ascii="Courier New" w:hAnsi="Courier New" w:cs="Courier New" w:hint="default"/>
+      </w:rPr>
+    </w:lvl>
+    <w:lvl w:ilvl="8" w:tplc="04090005" w:tentative="1">
+      <w:start w:val="1"/>
+      <w:numFmt w:val="bullet"/>
+      <w:lvlText w:val=""/>
+      <w:lvlJc w:val="left"/>
+      <w:pPr>
+        <w:ind w:left="6480" w:hanging="360"/>
+      </w:pPr>
+      <w:rPr>
+        <w:rFonts w:ascii="Wingdings" w:hAnsi="Wingdings" w:hint="default"/>
+      </w:rPr>
+    </w:lvl>
+  </w:abstractNum>
+  <w:abstractNum w:abstractNumId="12" w15:restartNumberingAfterBreak="0">
     <w:nsid w:val="74DC7713"/>
     <w:multiLevelType w:val="multilevel"/>
     <w:tmpl w:val="74DC7713"/>
@@ -10632,7 +12106,7 @@
     <w:abstractNumId w:val="6"/>
   </w:num>
   <w:num w:numId="4" w16cid:durableId="1166818270">
-    <w:abstractNumId w:val="10"/>
+    <w:abstractNumId w:val="12"/>
   </w:num>
   <w:num w:numId="5" w16cid:durableId="1246453757">
     <w:abstractNumId w:val="3"/>
@@ -10655,11 +12129,17 @@
   <w:num w:numId="11" w16cid:durableId="1735817753">
     <w:abstractNumId w:val="0"/>
   </w:num>
+  <w:num w:numId="12" w16cid:durableId="982152968">
+    <w:abstractNumId w:val="10"/>
+  </w:num>
+  <w:num w:numId="13" w16cid:durableId="830871347">
+    <w:abstractNumId w:val="11"/>
+  </w:num>
 </w:numbering>
 </file>
 
 <file path=word/styles.xml><?xml version="1.0" encoding="utf-8"?>
-<w:styles xmlns:mc="http://schemas.openxmlformats.org/markup-compatibility/2006" xmlns:r="http://schemas.openxmlformats.org/officeDocument/2006/relationships" xmlns:w="http://schemas.openxmlformats.org/wordprocessingml/2006/main" xmlns:w14="http://schemas.microsoft.com/office/word/2010/wordml" xmlns:w15="http://schemas.microsoft.com/office/word/2012/wordml" xmlns:w16cex="http://schemas.microsoft.com/office/word/2018/wordml/cex" xmlns:w16cid="http://schemas.microsoft.com/office/word/2016/wordml/cid" xmlns:w16="http://schemas.microsoft.com/office/word/2018/wordml" xmlns:w16du="http://schemas.microsoft.com/office/word/2023/wordml/word16du" xmlns:w16sdtdh="http://schemas.microsoft.com/office/word/2020/wordml/sdtdatahash" xmlns:w16se="http://schemas.microsoft.com/office/word/2015/wordml/symex" mc:Ignorable="w14 w15 w16se w16cid w16 w16cex w16sdtdh w16du">
+<w:styles xmlns:mc="http://schemas.openxmlformats.org/markup-compatibility/2006" xmlns:r="http://schemas.openxmlformats.org/officeDocument/2006/relationships" xmlns:w="http://schemas.openxmlformats.org/wordprocessingml/2006/main" xmlns:w14="http://schemas.microsoft.com/office/word/2010/wordml" xmlns:w15="http://schemas.microsoft.com/office/word/2012/wordml" xmlns:w16cex="http://schemas.microsoft.com/office/word/2018/wordml/cex" xmlns:w16cid="http://schemas.microsoft.com/office/word/2016/wordml/cid" xmlns:w16="http://schemas.microsoft.com/office/word/2018/wordml" xmlns:w16du="http://schemas.microsoft.com/office/word/2023/wordml/word16du" xmlns:w16sdtdh="http://schemas.microsoft.com/office/word/2020/wordml/sdtdatahash" xmlns:w16sdtfl="http://schemas.microsoft.com/office/word/2024/wordml/sdtformatlock" xmlns:w16se="http://schemas.microsoft.com/office/word/2015/wordml/symex" mc:Ignorable="w14 w15 w16se w16cid w16 w16cex w16sdtdh w16sdtfl w16du">
   <w:docDefaults>
     <w:rPrDefault>
       <w:rPr>

</xml_diff>